<commit_message>
review essdive metadata, remove readme
</commit_message>
<xml_diff>
--- a/ESSDIVE_Metadata_Danczak_inreview_SPS_Null_Modeling.docx
+++ b/ESSDIVE_Metadata_Danczak_inreview_SPS_Null_Modeling.docx
@@ -5,6 +5,7 @@
     <w:p>
       <w:pPr>
         <w:pStyle w:val="Heading1"/>
+        <w:jc w:val="center"/>
       </w:pPr>
       <w:r>
         <w:t>ESS-DIVE Metadata for SPS Null Modeling Data Package</w:t>
@@ -31,10 +32,14 @@
       </w:r>
       <w:r>
         <w:br/>
-        <w:t>None</w:t>
       </w:r>
     </w:p>
     <w:p>
+      <w:pPr>
+        <w:rPr>
+          <w:ins w:id="0" w:author="Forbes, Brieanne" w:date="2026-06-11T08:39:00Z" w16du:dateUtc="2026-06-11T15:39:00Z"/>
+        </w:rPr>
+      </w:pPr>
       <w:r>
         <w:rPr>
           <w:b/>
@@ -43,33 +48,333 @@
       </w:r>
       <w:r>
         <w:br/>
-        <w:t xml:space="preserve">This data package is associated with the publication “Non-random processes impacting organic matter chemistry are maximized in mid-order streams” submitted to </w:t>
-      </w:r>
-      <w:r>
-        <w:t>L&amp;O</w:t>
-      </w:r>
-      <w:r>
-        <w:t xml:space="preserve"> by Danczak et al. (in review). This package contains data and scripts used to investigate dissolved organic matter (DOM) molecular chemistry and diversification processes across 47 surface-water sampling sites in the Yakima River Basin, Washington, USA, during an August 2021 sampling campaign. The package </w:t>
-      </w:r>
-      <w:r>
-        <w:t>contains</w:t>
-      </w:r>
-      <w:r>
-        <w:t xml:space="preserve"> analyses of ultrahigh-resolution Fourier transform ion cyclotron resonance mass spectrometry (FTICR-MS), geochemical measurements, geospatial attributes, molecular diversity, and meta-metabolome ecological null models</w:t>
-      </w:r>
-      <w:r>
-        <w:t xml:space="preserve"> needed to reproduce the main manuscript results. </w:t>
-      </w:r>
-      <w:r>
-        <w:t>For details on how to navigate data packages generated by this project, see https://data.ess-dive.lbl.gov/portals/PNNLRiverCorridorSFA/About.</w:t>
-      </w:r>
+      </w:r>
+      <w:ins w:id="1" w:author="Forbes, Brieanne" w:date="2026-06-11T08:39:00Z">
+        <w:r>
+          <w:t>NOTE: The manuscript associated with this data package is currently in review. The data may be revised based on reviewer feedback. Upon manuscript acceptance, this data package will be updated with the final dataset and additional metadata.</w:t>
+        </w:r>
+      </w:ins>
     </w:p>
     <w:p>
       <w:r>
-        <w:t>This data package is associated with the rcfsa-RC2-SPS_Null_Modeling repository found at https://github.com/river-corridors-sfa/rcfsa-RC2-SPS_Null_Modeling. At the directory level, the repository is organized into folders for Data, Geospatial Data, Supplemental_Files, Figures_pdf, src, and data_checks_reports, along with root-level analysis files including RC2_SPS_Analysis_V8.Rmd, RC2_SPS_Analysis_V8.html, and README.md. The Data folder contains tabular inputs and derived files used in the manuscript analysis; the Geospatial Data folder contains climate and water-balance, hydrologic, land-cover, population/regional water-use, stream, topographic, and stream-order attribute CSV files; the src folder contains scripts used to process data, run analyses, and generate figures; Figures_pdf contains manuscript figure outputs; Supplemental_Files contains supplemental analysis products; and data_checks_reports contains automated checking outputs. In addition to this readme, this data package also includes a file-level metadata (FLMD) file that describes each file and a data dictionary (DD) that describes all column/row headers and variable definitions.</w:t>
+        <w:t xml:space="preserve">This data package is associated with the publication “Non-random processes impacting organic matter chemistry are maximized in mid-order streams” submitted to </w:t>
+      </w:r>
+      <w:ins w:id="2" w:author="Forbes, Brieanne" w:date="2026-06-11T08:39:00Z">
+        <w:r>
+          <w:rPr>
+            <w:rPrChange w:id="3" w:author="Forbes, Brieanne" w:date="2026-06-11T08:39:00Z" w16du:dateUtc="2026-06-11T15:39:00Z">
+              <w:rPr>
+                <w:b/>
+                <w:bCs/>
+              </w:rPr>
+            </w:rPrChange>
+          </w:rPr>
+          <w:t>Limnology and Oceanography</w:t>
+        </w:r>
+      </w:ins>
+      <w:ins w:id="4" w:author="Forbes, Brieanne" w:date="2026-06-11T08:39:00Z" w16du:dateUtc="2026-06-11T15:39:00Z">
+        <w:r>
+          <w:rPr>
+            <w:b/>
+            <w:bCs/>
+          </w:rPr>
+          <w:t xml:space="preserve"> (</w:t>
+        </w:r>
+      </w:ins>
+      <w:r>
+        <w:t>L&amp;O</w:t>
+      </w:r>
+      <w:ins w:id="5" w:author="Forbes, Brieanne" w:date="2026-06-11T08:39:00Z" w16du:dateUtc="2026-06-11T15:39:00Z">
+        <w:r>
+          <w:t>)</w:t>
+        </w:r>
+      </w:ins>
+      <w:r>
+        <w:t xml:space="preserve"> by Danczak et al. (in review). This package contains data and scripts used to investigate dissolved organic matter (DOM) molecular chemistry and diversification processes across 47 surface-water sampling sites in the Yakima River Basin, Washington, USA, during an August 2021 sampling campaign. The package </w:t>
+      </w:r>
+      <w:r>
+        <w:t>contains</w:t>
+      </w:r>
+      <w:r>
+        <w:t xml:space="preserve"> analyses of ultrahigh-resolution Fourier transform ion cyclotron resonance mass spectrometry (FTICR-MS), geochemical measurements, geospatial attributes, molecular diversity, and meta-metabolome ecological null models</w:t>
+      </w:r>
+      <w:r>
+        <w:t xml:space="preserve"> needed to reproduce the main manuscript results. </w:t>
+      </w:r>
+      <w:r>
+        <w:t>For details on how to navigate data packages generated by this project, see https://data.ess-dive.lbl.gov/portals/PNNLRiverCorridorSFA/About.</w:t>
       </w:r>
     </w:p>
     <w:p>
+      <w:del w:id="6" w:author="Forbes, Brieanne" w:date="2026-06-11T08:42:00Z" w16du:dateUtc="2026-06-11T15:42:00Z">
+        <w:r>
+          <w:delText>This data package is associated with the rcfsa-RC2-SPS_Null_Modeling repository found at https://github.com/river-corridors-sfa/rcfsa-RC2-SPS_Null_Modeling</w:delText>
+        </w:r>
+      </w:del>
+      <w:del w:id="7" w:author="Forbes, Brieanne" w:date="2026-06-11T08:45:00Z" w16du:dateUtc="2026-06-11T15:45:00Z">
+        <w:r>
+          <w:delText xml:space="preserve">. </w:delText>
+        </w:r>
+      </w:del>
+      <w:del w:id="8" w:author="Forbes, Brieanne" w:date="2026-06-11T08:43:00Z" w16du:dateUtc="2026-06-11T15:43:00Z">
+        <w:r>
+          <w:delText xml:space="preserve">At the directory level, the repository </w:delText>
+        </w:r>
+      </w:del>
+      <w:ins w:id="9" w:author="Forbes, Brieanne" w:date="2026-06-11T08:43:00Z" w16du:dateUtc="2026-06-11T15:43:00Z">
+        <w:r>
+          <w:t>This data package contains</w:t>
+        </w:r>
+      </w:ins>
+      <w:ins w:id="10" w:author="Forbes, Brieanne" w:date="2026-06-11T08:44:00Z" w16du:dateUtc="2026-06-11T15:44:00Z">
+        <w:r>
+          <w:t xml:space="preserve"> an R-Markdown file for analys</w:t>
+        </w:r>
+      </w:ins>
+      <w:ins w:id="11" w:author="Forbes, Brieanne" w:date="2026-06-11T08:45:00Z" w16du:dateUtc="2026-06-11T15:45:00Z">
+        <w:r>
+          <w:t>e</w:t>
+        </w:r>
+      </w:ins>
+      <w:ins w:id="12" w:author="Forbes, Brieanne" w:date="2026-06-11T08:44:00Z" w16du:dateUtc="2026-06-11T15:44:00Z">
+        <w:r>
+          <w:t xml:space="preserve">s and </w:t>
+        </w:r>
+      </w:ins>
+      <w:ins w:id="13" w:author="Forbes, Brieanne" w:date="2026-06-11T08:45:00Z" w16du:dateUtc="2026-06-11T15:45:00Z">
+        <w:r>
+          <w:t>five</w:t>
+        </w:r>
+      </w:ins>
+      <w:ins w:id="14" w:author="Forbes, Brieanne" w:date="2026-06-11T08:44:00Z" w16du:dateUtc="2026-06-11T15:44:00Z">
+        <w:r>
+          <w:t xml:space="preserve"> folders:</w:t>
+        </w:r>
+      </w:ins>
+      <w:ins w:id="15" w:author="Forbes, Brieanne" w:date="2026-06-11T08:45:00Z" w16du:dateUtc="2026-06-11T15:45:00Z">
+        <w:r>
+          <w:t xml:space="preserve"> </w:t>
+        </w:r>
+      </w:ins>
+      <w:del w:id="16" w:author="Forbes, Brieanne" w:date="2026-06-11T08:43:00Z" w16du:dateUtc="2026-06-11T15:43:00Z">
+        <w:r>
+          <w:delText>is organized into</w:delText>
+        </w:r>
+      </w:del>
+      <w:del w:id="17" w:author="Forbes, Brieanne" w:date="2026-06-11T08:44:00Z" w16du:dateUtc="2026-06-11T15:44:00Z">
+        <w:r>
+          <w:delText xml:space="preserve"> folders </w:delText>
+        </w:r>
+      </w:del>
+      <w:del w:id="18" w:author="Forbes, Brieanne" w:date="2026-06-11T08:43:00Z" w16du:dateUtc="2026-06-11T15:43:00Z">
+        <w:r>
+          <w:delText xml:space="preserve">for </w:delText>
+        </w:r>
+      </w:del>
+      <w:ins w:id="19" w:author="Forbes, Brieanne" w:date="2026-06-11T08:43:00Z" w16du:dateUtc="2026-06-11T15:43:00Z">
+        <w:r>
+          <w:t xml:space="preserve">(1) </w:t>
+        </w:r>
+      </w:ins>
+      <w:r>
+        <w:t xml:space="preserve">Data, </w:t>
+      </w:r>
+      <w:ins w:id="20" w:author="Forbes, Brieanne" w:date="2026-06-11T08:43:00Z" w16du:dateUtc="2026-06-11T15:43:00Z">
+        <w:r>
+          <w:t xml:space="preserve">(2) </w:t>
+        </w:r>
+      </w:ins>
+      <w:r>
+        <w:t>Geospatial Data,</w:t>
+      </w:r>
+      <w:ins w:id="21" w:author="Forbes, Brieanne" w:date="2026-06-11T08:43:00Z" w16du:dateUtc="2026-06-11T15:43:00Z">
+        <w:r>
+          <w:t xml:space="preserve"> (3)</w:t>
+        </w:r>
+      </w:ins>
+      <w:r>
+        <w:t xml:space="preserve"> Supplemental_Files, </w:t>
+      </w:r>
+      <w:ins w:id="22" w:author="Forbes, Brieanne" w:date="2026-06-11T08:43:00Z" w16du:dateUtc="2026-06-11T15:43:00Z">
+        <w:r>
+          <w:t>(</w:t>
+        </w:r>
+      </w:ins>
+      <w:ins w:id="23" w:author="Forbes, Brieanne" w:date="2026-06-11T08:45:00Z" w16du:dateUtc="2026-06-11T15:45:00Z">
+        <w:r>
+          <w:t>5</w:t>
+        </w:r>
+      </w:ins>
+      <w:ins w:id="24" w:author="Forbes, Brieanne" w:date="2026-06-11T08:43:00Z" w16du:dateUtc="2026-06-11T15:43:00Z">
+        <w:r>
+          <w:t xml:space="preserve">) </w:t>
+        </w:r>
+      </w:ins>
+      <w:r>
+        <w:t>Figures_pdf,</w:t>
+      </w:r>
+      <w:ins w:id="25" w:author="Forbes, Brieanne" w:date="2026-06-11T08:45:00Z" w16du:dateUtc="2026-06-11T15:45:00Z">
+        <w:r>
+          <w:t xml:space="preserve"> </w:t>
+        </w:r>
+      </w:ins>
+      <w:ins w:id="26" w:author="Forbes, Brieanne" w:date="2026-06-11T08:43:00Z" w16du:dateUtc="2026-06-11T15:43:00Z">
+        <w:r>
+          <w:t xml:space="preserve">(4) </w:t>
+        </w:r>
+      </w:ins>
+      <w:del w:id="27" w:author="Forbes, Brieanne" w:date="2026-06-11T08:45:00Z" w16du:dateUtc="2026-06-11T15:45:00Z">
+        <w:r>
+          <w:delText xml:space="preserve"> </w:delText>
+        </w:r>
+      </w:del>
+      <w:ins w:id="28" w:author="Forbes, Brieanne" w:date="2026-06-11T08:45:00Z" w16du:dateUtc="2026-06-11T15:45:00Z">
+        <w:r>
+          <w:t xml:space="preserve">and </w:t>
+        </w:r>
+      </w:ins>
+      <w:r>
+        <w:t>src</w:t>
+      </w:r>
+      <w:del w:id="29" w:author="Forbes, Brieanne" w:date="2026-06-11T08:45:00Z" w16du:dateUtc="2026-06-11T15:45:00Z">
+        <w:r>
+          <w:delText>, and data_checks_reports</w:delText>
+        </w:r>
+      </w:del>
+      <w:ins w:id="30" w:author="Forbes, Brieanne" w:date="2026-06-11T08:44:00Z" w16du:dateUtc="2026-06-11T15:44:00Z">
+        <w:r>
+          <w:t>.</w:t>
+        </w:r>
+      </w:ins>
+      <w:del w:id="31" w:author="Forbes, Brieanne" w:date="2026-06-11T08:44:00Z" w16du:dateUtc="2026-06-11T15:44:00Z">
+        <w:r>
+          <w:delText>, along with root-level analysis files including RC2_SPS_Analysis_V8.Rmd, RC2_SPS_Analysis_V8.html, and README.md.</w:delText>
+        </w:r>
+      </w:del>
+      <w:r>
+        <w:t xml:space="preserve"> The Data folder contains tabular inputs and derived files used in the manuscript analysis</w:t>
+      </w:r>
+      <w:ins w:id="32" w:author="Forbes, Brieanne" w:date="2026-06-11T08:45:00Z" w16du:dateUtc="2026-06-11T15:45:00Z">
+        <w:r>
+          <w:t>. T</w:t>
+        </w:r>
+      </w:ins>
+      <w:del w:id="33" w:author="Forbes, Brieanne" w:date="2026-06-11T08:45:00Z" w16du:dateUtc="2026-06-11T15:45:00Z">
+        <w:r>
+          <w:delText>; t</w:delText>
+        </w:r>
+      </w:del>
+      <w:r>
+        <w:t>he Geospatial Data folder contains climate and water-balance, hydrologic, land-cover, population/regional water-use, stream, topographic, and stream-order attribute CSV files</w:t>
+      </w:r>
+      <w:ins w:id="34" w:author="Forbes, Brieanne" w:date="2026-06-11T08:46:00Z" w16du:dateUtc="2026-06-11T15:46:00Z">
+        <w:r>
+          <w:t>. T</w:t>
+        </w:r>
+      </w:ins>
+      <w:del w:id="35" w:author="Forbes, Brieanne" w:date="2026-06-11T08:46:00Z" w16du:dateUtc="2026-06-11T15:46:00Z">
+        <w:r>
+          <w:delText>; t</w:delText>
+        </w:r>
+      </w:del>
+      <w:r>
+        <w:t>he src folder contains scripts used to process data, run analyses, and generate figures</w:t>
+      </w:r>
+      <w:ins w:id="36" w:author="Forbes, Brieanne" w:date="2026-06-11T08:46:00Z" w16du:dateUtc="2026-06-11T15:46:00Z">
+        <w:r>
+          <w:t>. The F</w:t>
+        </w:r>
+      </w:ins>
+      <w:del w:id="37" w:author="Forbes, Brieanne" w:date="2026-06-11T08:46:00Z" w16du:dateUtc="2026-06-11T15:46:00Z">
+        <w:r>
+          <w:delText>; F</w:delText>
+        </w:r>
+      </w:del>
+      <w:r>
+        <w:t>igures_pdf</w:t>
+      </w:r>
+      <w:ins w:id="38" w:author="Forbes, Brieanne" w:date="2026-06-11T08:46:00Z" w16du:dateUtc="2026-06-11T15:46:00Z">
+        <w:r>
+          <w:t xml:space="preserve"> folder</w:t>
+        </w:r>
+      </w:ins>
+      <w:r>
+        <w:t xml:space="preserve"> contains manuscript figure outputs</w:t>
+      </w:r>
+      <w:ins w:id="39" w:author="Forbes, Brieanne" w:date="2026-06-11T08:46:00Z" w16du:dateUtc="2026-06-11T15:46:00Z">
+        <w:r>
+          <w:t>.</w:t>
+        </w:r>
+      </w:ins>
+      <w:del w:id="40" w:author="Forbes, Brieanne" w:date="2026-06-11T08:46:00Z" w16du:dateUtc="2026-06-11T15:46:00Z">
+        <w:r>
+          <w:delText>;</w:delText>
+        </w:r>
+      </w:del>
+      <w:r>
+        <w:t xml:space="preserve"> </w:t>
+      </w:r>
+      <w:ins w:id="41" w:author="Forbes, Brieanne" w:date="2026-06-11T08:46:00Z" w16du:dateUtc="2026-06-11T15:46:00Z">
+        <w:r>
+          <w:t xml:space="preserve">The </w:t>
+        </w:r>
+      </w:ins>
+      <w:r>
+        <w:t xml:space="preserve">Supplemental_Files </w:t>
+      </w:r>
+      <w:ins w:id="42" w:author="Forbes, Brieanne" w:date="2026-06-11T08:46:00Z" w16du:dateUtc="2026-06-11T15:46:00Z">
+        <w:r>
+          <w:t xml:space="preserve">folder </w:t>
+        </w:r>
+      </w:ins>
+      <w:r>
+        <w:t>contains supplemental analysis products</w:t>
+      </w:r>
+      <w:del w:id="43" w:author="Forbes, Brieanne" w:date="2026-06-11T08:47:00Z" w16du:dateUtc="2026-06-11T15:47:00Z">
+        <w:r>
+          <w:delText xml:space="preserve">; and data_checks_reports contains automated checking outputs. </w:delText>
+        </w:r>
+      </w:del>
+      <w:ins w:id="44" w:author="Forbes, Brieanne" w:date="2026-06-11T08:47:00Z" w16du:dateUtc="2026-06-11T15:47:00Z">
+        <w:r>
+          <w:t>.</w:t>
+        </w:r>
+      </w:ins>
+      <w:del w:id="45" w:author="Forbes, Brieanne" w:date="2026-06-11T08:40:00Z" w16du:dateUtc="2026-06-11T15:40:00Z">
+        <w:r>
+          <w:delText>In addition to this readme, this data package also includes a file-level metadata (FLMD) file that describes each file and a data dictionary (DD) that describes all column/row headers and variable definitions.</w:delText>
+        </w:r>
+      </w:del>
+      <w:ins w:id="46" w:author="Forbes, Brieanne" w:date="2026-06-11T08:43:00Z" w16du:dateUtc="2026-06-11T15:43:00Z">
+        <w:r>
+          <w:t xml:space="preserve"> </w:t>
+        </w:r>
+      </w:ins>
+      <w:ins w:id="47" w:author="Forbes, Brieanne" w:date="2026-06-11T08:47:00Z" w16du:dateUtc="2026-06-11T15:47:00Z">
+        <w:r>
+          <w:t>All files are .csv, .pdf, .html, .png, .R, .Rmd, .svg, or .tre.</w:t>
+        </w:r>
+      </w:ins>
+      <w:ins w:id="48" w:author="Forbes, Brieanne" w:date="2026-06-11T08:48:00Z" w16du:dateUtc="2026-06-11T15:48:00Z">
+        <w:r>
+          <w:t xml:space="preserve"> </w:t>
+        </w:r>
+      </w:ins>
+      <w:ins w:id="49" w:author="Forbes, Brieanne" w:date="2026-06-11T08:43:00Z" w16du:dateUtc="2026-06-11T15:43:00Z">
+        <w:r>
+          <w:t>This data package is associated with the rcfsa-RC2-SPS_Null_Modeling repository found at https://github.com/river-corridors-sfa/rcfsa-RC2-SPS_Null_Modeling</w:t>
+        </w:r>
+      </w:ins>
+      <w:ins w:id="50" w:author="Forbes, Brieanne" w:date="2026-06-11T08:47:00Z" w16du:dateUtc="2026-06-11T15:47:00Z">
+        <w:r>
+          <w:t>.</w:t>
+        </w:r>
+      </w:ins>
+    </w:p>
+    <w:p>
+      <w:pPr>
+        <w:spacing w:after="0"/>
+      </w:pPr>
       <w:r>
         <w:rPr>
           <w:b/>
@@ -82,253 +387,984 @@
       </w:r>
     </w:p>
     <w:p>
+      <w:pPr>
+        <w:spacing w:after="0"/>
+        <w:rPr>
+          <w:ins w:id="51" w:author="Forbes, Brieanne" w:date="2026-06-11T08:48:00Z" w16du:dateUtc="2026-06-11T15:48:00Z"/>
+        </w:rPr>
+      </w:pPr>
       <w:r>
         <w:t>Yakima River Basin</w:t>
       </w:r>
     </w:p>
     <w:p>
-      <w:r>
-        <w:t>surface water</w:t>
-      </w:r>
+      <w:pPr>
+        <w:spacing w:after="0"/>
+      </w:pPr>
+      <w:ins w:id="52" w:author="Forbes, Brieanne" w:date="2026-06-11T08:48:00Z" w16du:dateUtc="2026-06-11T15:48:00Z">
+        <w:r>
+          <w:t>YRB</w:t>
+        </w:r>
+      </w:ins>
     </w:p>
     <w:p>
-      <w:r>
-        <w:t>dissolved organic matter</w:t>
+      <w:pPr>
+        <w:spacing w:after="0"/>
+      </w:pPr>
+      <w:ins w:id="53" w:author="Forbes, Brieanne" w:date="2026-06-11T08:48:00Z" w16du:dateUtc="2026-06-11T15:48:00Z">
+        <w:r>
+          <w:t>S</w:t>
+        </w:r>
+      </w:ins>
+      <w:del w:id="54" w:author="Forbes, Brieanne" w:date="2026-06-11T08:48:00Z" w16du:dateUtc="2026-06-11T15:48:00Z">
+        <w:r>
+          <w:delText>s</w:delText>
+        </w:r>
+      </w:del>
+      <w:r>
+        <w:t>urface water</w:t>
       </w:r>
     </w:p>
     <w:p>
-      <w:r>
-        <w:t>DOM</w:t>
+      <w:pPr>
+        <w:spacing w:after="0"/>
+      </w:pPr>
+      <w:ins w:id="55" w:author="Forbes, Brieanne" w:date="2026-06-11T08:48:00Z" w16du:dateUtc="2026-06-11T15:48:00Z">
+        <w:r>
+          <w:t>D</w:t>
+        </w:r>
+      </w:ins>
+      <w:del w:id="56" w:author="Forbes, Brieanne" w:date="2026-06-11T08:48:00Z" w16du:dateUtc="2026-06-11T15:48:00Z">
+        <w:r>
+          <w:delText>d</w:delText>
+        </w:r>
+      </w:del>
+      <w:r>
+        <w:t>issolved organic matter</w:t>
       </w:r>
     </w:p>
     <w:p>
-      <w:r>
-        <w:t>organic matter</w:t>
+      <w:pPr>
+        <w:spacing w:after="0"/>
+      </w:pPr>
+      <w:r>
+        <w:t>DOM</w:t>
       </w:r>
     </w:p>
     <w:p>
-      <w:r>
-        <w:t>OM</w:t>
+      <w:pPr>
+        <w:spacing w:after="0"/>
+      </w:pPr>
+      <w:ins w:id="57" w:author="Forbes, Brieanne" w:date="2026-06-11T08:48:00Z" w16du:dateUtc="2026-06-11T15:48:00Z">
+        <w:r>
+          <w:t>O</w:t>
+        </w:r>
+      </w:ins>
+      <w:del w:id="58" w:author="Forbes, Brieanne" w:date="2026-06-11T08:48:00Z" w16du:dateUtc="2026-06-11T15:48:00Z">
+        <w:r>
+          <w:delText>o</w:delText>
+        </w:r>
+      </w:del>
+      <w:r>
+        <w:t>rganic matter</w:t>
       </w:r>
     </w:p>
     <w:p>
-      <w:r>
-        <w:t>FTICR-MS</w:t>
+      <w:pPr>
+        <w:spacing w:after="0"/>
+      </w:pPr>
+      <w:r>
+        <w:t>OM</w:t>
       </w:r>
     </w:p>
     <w:p>
-      <w:r>
-        <w:t>Fourier transform ion cyclotron resonance mass spectrometry</w:t>
-      </w:r>
+      <w:pPr>
+        <w:spacing w:after="0"/>
+        <w:rPr>
+          <w:moveFrom w:id="59" w:author="Forbes, Brieanne" w:date="2026-06-11T08:49:00Z" w16du:dateUtc="2026-06-11T15:49:00Z"/>
+        </w:rPr>
+      </w:pPr>
+      <w:moveFromRangeStart w:id="60" w:author="Forbes, Brieanne" w:date="2026-06-11T08:49:00Z" w:name="move232060193"/>
+      <w:moveFrom w:id="61" w:author="Forbes, Brieanne" w:date="2026-06-11T08:49:00Z" w16du:dateUtc="2026-06-11T15:49:00Z">
+        <w:r>
+          <w:t>FTICR-MS</w:t>
+        </w:r>
+      </w:moveFrom>
     </w:p>
     <w:p>
-      <w:r>
-        <w:t>meta-metabolome ecology</w:t>
+      <w:pPr>
+        <w:spacing w:after="0"/>
+        <w:rPr>
+          <w:moveFrom w:id="62" w:author="Forbes, Brieanne" w:date="2026-06-11T08:49:00Z" w16du:dateUtc="2026-06-11T15:49:00Z"/>
+        </w:rPr>
+      </w:pPr>
+      <w:moveFrom w:id="63" w:author="Forbes, Brieanne" w:date="2026-06-11T08:49:00Z" w16du:dateUtc="2026-06-11T15:49:00Z">
+        <w:r>
+          <w:t>Fourier transform ion cyclotron resonance mass spectrometry</w:t>
+        </w:r>
+      </w:moveFrom>
+    </w:p>
+    <w:moveFromRangeEnd w:id="60"/>
+    <w:p>
+      <w:pPr>
+        <w:spacing w:after="0"/>
+      </w:pPr>
+      <w:ins w:id="64" w:author="Forbes, Brieanne" w:date="2026-06-11T08:48:00Z" w16du:dateUtc="2026-06-11T15:48:00Z">
+        <w:r>
+          <w:t>M</w:t>
+        </w:r>
+      </w:ins>
+      <w:del w:id="65" w:author="Forbes, Brieanne" w:date="2026-06-11T08:48:00Z" w16du:dateUtc="2026-06-11T15:48:00Z">
+        <w:r>
+          <w:delText>M</w:delText>
+        </w:r>
+      </w:del>
+      <w:r>
+        <w:t>eta-metabolome ecology</w:t>
       </w:r>
     </w:p>
     <w:p>
-      <w:r>
-        <w:lastRenderedPageBreak/>
-        <w:t>null modeling</w:t>
+      <w:pPr>
+        <w:spacing w:after="0"/>
+        <w:rPr>
+          <w:ins w:id="66" w:author="Forbes, Brieanne" w:date="2026-06-11T08:48:00Z" w16du:dateUtc="2026-06-11T15:48:00Z"/>
+        </w:rPr>
+      </w:pPr>
+      <w:ins w:id="67" w:author="Forbes, Brieanne" w:date="2026-06-11T08:48:00Z" w16du:dateUtc="2026-06-11T15:48:00Z">
+        <w:r>
+          <w:t>N</w:t>
+        </w:r>
+      </w:ins>
+      <w:del w:id="68" w:author="Forbes, Brieanne" w:date="2026-06-11T08:48:00Z" w16du:dateUtc="2026-06-11T15:48:00Z">
+        <w:r>
+          <w:delText>n</w:delText>
+        </w:r>
+      </w:del>
+      <w:r>
+        <w:t>ull modeling</w:t>
       </w:r>
     </w:p>
     <w:p>
-      <w:r>
-        <w:t>βNTI</w:t>
-      </w:r>
+      <w:pPr>
+        <w:spacing w:after="0"/>
+        <w:rPr>
+          <w:del w:id="69" w:author="Forbes, Brieanne" w:date="2026-06-11T08:49:00Z" w16du:dateUtc="2026-06-11T15:49:00Z"/>
+        </w:rPr>
+      </w:pPr>
     </w:p>
     <w:p>
-      <w:r>
-        <w:t>molecular formula</w:t>
-      </w:r>
+      <w:pPr>
+        <w:spacing w:after="0"/>
+        <w:rPr>
+          <w:del w:id="70" w:author="Forbes, Brieanne" w:date="2026-06-11T08:49:00Z" w16du:dateUtc="2026-06-11T15:49:00Z"/>
+        </w:rPr>
+      </w:pPr>
+      <w:del w:id="71" w:author="Forbes, Brieanne" w:date="2026-06-11T08:49:00Z" w16du:dateUtc="2026-06-11T15:49:00Z">
+        <w:r>
+          <w:delText>βNTI</w:delText>
+        </w:r>
+      </w:del>
     </w:p>
     <w:p>
-      <w:r>
-        <w:t>molecular richness</w:t>
+      <w:pPr>
+        <w:spacing w:after="0"/>
+      </w:pPr>
+      <w:ins w:id="72" w:author="Forbes, Brieanne" w:date="2026-06-11T08:49:00Z" w16du:dateUtc="2026-06-11T15:49:00Z">
+        <w:r>
+          <w:t>M</w:t>
+        </w:r>
+      </w:ins>
+      <w:del w:id="73" w:author="Forbes, Brieanne" w:date="2026-06-11T08:48:00Z" w16du:dateUtc="2026-06-11T15:48:00Z">
+        <w:r>
+          <w:delText>m</w:delText>
+        </w:r>
+      </w:del>
+      <w:r>
+        <w:t>olecular formula</w:t>
       </w:r>
     </w:p>
     <w:p>
-      <w:r>
-        <w:t>geochemistry</w:t>
+      <w:pPr>
+        <w:spacing w:after="0"/>
+      </w:pPr>
+      <w:ins w:id="74" w:author="Forbes, Brieanne" w:date="2026-06-11T08:48:00Z" w16du:dateUtc="2026-06-11T15:48:00Z">
+        <w:r>
+          <w:t>M</w:t>
+        </w:r>
+      </w:ins>
+      <w:del w:id="75" w:author="Forbes, Brieanne" w:date="2026-06-11T08:48:00Z" w16du:dateUtc="2026-06-11T15:48:00Z">
+        <w:r>
+          <w:delText>m</w:delText>
+        </w:r>
+      </w:del>
+      <w:r>
+        <w:t>olecular richness</w:t>
       </w:r>
     </w:p>
     <w:p>
-      <w:r>
-        <w:t>geospatial attributes</w:t>
+      <w:pPr>
+        <w:spacing w:after="0"/>
+      </w:pPr>
+      <w:ins w:id="76" w:author="Forbes, Brieanne" w:date="2026-06-11T08:49:00Z" w16du:dateUtc="2026-06-11T15:49:00Z">
+        <w:r>
+          <w:t>G</w:t>
+        </w:r>
+      </w:ins>
+      <w:del w:id="77" w:author="Forbes, Brieanne" w:date="2026-06-11T08:49:00Z" w16du:dateUtc="2026-06-11T15:49:00Z">
+        <w:r>
+          <w:delText>g</w:delText>
+        </w:r>
+      </w:del>
+      <w:r>
+        <w:t>eochemistry</w:t>
       </w:r>
     </w:p>
     <w:p>
-      <w:r>
-        <w:t>stream order</w:t>
+      <w:pPr>
+        <w:spacing w:after="0"/>
+      </w:pPr>
+      <w:ins w:id="78" w:author="Forbes, Brieanne" w:date="2026-06-11T08:49:00Z" w16du:dateUtc="2026-06-11T15:49:00Z">
+        <w:r>
+          <w:t>G</w:t>
+        </w:r>
+      </w:ins>
+      <w:del w:id="79" w:author="Forbes, Brieanne" w:date="2026-06-11T08:49:00Z" w16du:dateUtc="2026-06-11T15:49:00Z">
+        <w:r>
+          <w:delText>g</w:delText>
+        </w:r>
+      </w:del>
+      <w:r>
+        <w:t>eospatial attributes</w:t>
       </w:r>
     </w:p>
     <w:p>
-      <w:r>
-        <w:t>drainage area</w:t>
-      </w:r>
+      <w:pPr>
+        <w:spacing w:after="0"/>
+        <w:rPr>
+          <w:del w:id="80" w:author="Forbes, Brieanne" w:date="2026-06-11T08:50:00Z" w16du:dateUtc="2026-06-11T15:50:00Z"/>
+        </w:rPr>
+      </w:pPr>
+      <w:del w:id="81" w:author="Forbes, Brieanne" w:date="2026-06-11T08:49:00Z" w16du:dateUtc="2026-06-11T15:49:00Z">
+        <w:r>
+          <w:delText>s</w:delText>
+        </w:r>
+      </w:del>
+      <w:del w:id="82" w:author="Forbes, Brieanne" w:date="2026-06-11T08:50:00Z" w16du:dateUtc="2026-06-11T15:50:00Z">
+        <w:r>
+          <w:delText>tream order</w:delText>
+        </w:r>
+      </w:del>
     </w:p>
     <w:p>
-      <w:r>
-        <w:t>NHDPlus</w:t>
-      </w:r>
+      <w:pPr>
+        <w:spacing w:after="0"/>
+        <w:rPr>
+          <w:del w:id="83" w:author="Forbes, Brieanne" w:date="2026-06-11T08:50:00Z" w16du:dateUtc="2026-06-11T15:50:00Z"/>
+        </w:rPr>
+      </w:pPr>
+      <w:del w:id="84" w:author="Forbes, Brieanne" w:date="2026-06-11T08:49:00Z" w16du:dateUtc="2026-06-11T15:49:00Z">
+        <w:r>
+          <w:delText>d</w:delText>
+        </w:r>
+      </w:del>
+      <w:del w:id="85" w:author="Forbes, Brieanne" w:date="2026-06-11T08:50:00Z" w16du:dateUtc="2026-06-11T15:50:00Z">
+        <w:r>
+          <w:delText>rainage area</w:delText>
+        </w:r>
+      </w:del>
     </w:p>
     <w:p>
-      <w:r>
-        <w:t>ESS-DIVE CSV File Formatting Guidelines Reporting Format</w:t>
+      <w:pPr>
+        <w:spacing w:after="0"/>
+      </w:pPr>
+      <w:r>
+        <w:t>NHDPlus</w:t>
       </w:r>
     </w:p>
     <w:p>
-      <w:r>
-        <w:t>ESS-DIVE File Level Metadata Reporting Format</w:t>
+      <w:pPr>
+        <w:spacing w:after="0"/>
+      </w:pPr>
+      <w:r>
+        <w:t>ESS-DIVE CSV File Formatting Guidelines Reporting Format</w:t>
       </w:r>
     </w:p>
     <w:p>
+      <w:pPr>
+        <w:spacing w:after="0"/>
+      </w:pPr>
+      <w:commentRangeStart w:id="86"/>
+      <w:r>
+        <w:t>ESS-DIVE File Level Metadata Reporting Format</w:t>
+      </w:r>
+      <w:commentRangeEnd w:id="86"/>
+      <w:r>
+        <w:rPr>
+          <w:rStyle w:val="CommentReference"/>
+          <w:sz w:val="20"/>
+          <w:szCs w:val="22"/>
+        </w:rPr>
+        <w:commentReference w:id="86"/>
+      </w:r>
+    </w:p>
+    <w:p>
+      <w:pPr>
+        <w:spacing w:after="0"/>
+      </w:pPr>
+    </w:p>
+    <w:p>
+      <w:pPr>
+        <w:spacing w:after="0"/>
+        <w:rPr>
+          <w:moveTo w:id="87" w:author="Forbes, Brieanne" w:date="2026-06-11T08:49:00Z" w16du:dateUtc="2026-06-11T15:49:00Z"/>
+        </w:rPr>
+      </w:pPr>
       <w:r>
         <w:rPr>
           <w:b/>
         </w:rPr>
+        <w:lastRenderedPageBreak/>
         <w:t>Data variables:</w:t>
       </w:r>
       <w:r>
         <w:br/>
-        <w:t>FTICR-MS</w:t>
-      </w:r>
+      </w:r>
+      <w:moveToRangeStart w:id="88" w:author="Forbes, Brieanne" w:date="2026-06-11T08:49:00Z" w:name="move232060193"/>
+      <w:moveTo w:id="89" w:author="Forbes, Brieanne" w:date="2026-06-11T08:49:00Z" w16du:dateUtc="2026-06-11T15:49:00Z">
+        <w:r>
+          <w:t>FTICR-MS</w:t>
+        </w:r>
+      </w:moveTo>
     </w:p>
     <w:p>
-      <w:r>
-        <w:t>molecular formula</w:t>
-      </w:r>
+      <w:pPr>
+        <w:spacing w:after="0"/>
+        <w:rPr>
+          <w:del w:id="90" w:author="Forbes, Brieanne" w:date="2026-06-11T08:49:00Z" w16du:dateUtc="2026-06-11T15:49:00Z"/>
+          <w:moveTo w:id="91" w:author="Forbes, Brieanne" w:date="2026-06-11T08:49:00Z" w16du:dateUtc="2026-06-11T15:49:00Z"/>
+        </w:rPr>
+      </w:pPr>
+      <w:moveTo w:id="92" w:author="Forbes, Brieanne" w:date="2026-06-11T08:49:00Z" w16du:dateUtc="2026-06-11T15:49:00Z">
+        <w:r>
+          <w:t>Fourier transform ion cyclotron resonance mass spectrometry</w:t>
+        </w:r>
+      </w:moveTo>
+    </w:p>
+    <w:moveToRangeEnd w:id="88"/>
+    <w:p>
+      <w:pPr>
+        <w:spacing w:after="0"/>
+      </w:pPr>
+      <w:del w:id="93" w:author="Forbes, Brieanne" w:date="2026-06-11T08:49:00Z" w16du:dateUtc="2026-06-11T15:49:00Z">
+        <w:r>
+          <w:delText>FTICR-MS</w:delText>
+        </w:r>
+      </w:del>
     </w:p>
     <w:p>
-      <w:r>
-        <w:t>molecular richness</w:t>
+      <w:pPr>
+        <w:spacing w:after="0"/>
+      </w:pPr>
+      <w:ins w:id="94" w:author="Forbes, Brieanne" w:date="2026-06-11T08:49:00Z" w16du:dateUtc="2026-06-11T15:49:00Z">
+        <w:r>
+          <w:t>M</w:t>
+        </w:r>
+      </w:ins>
+      <w:del w:id="95" w:author="Forbes, Brieanne" w:date="2026-06-11T08:49:00Z" w16du:dateUtc="2026-06-11T15:49:00Z">
+        <w:r>
+          <w:delText>m</w:delText>
+        </w:r>
+      </w:del>
+      <w:r>
+        <w:t>olecular formula</w:t>
       </w:r>
     </w:p>
     <w:p>
-      <w:r>
-        <w:t>presence/absence peak table</w:t>
+      <w:pPr>
+        <w:spacing w:after="0"/>
+        <w:rPr>
+          <w:ins w:id="96" w:author="Forbes, Brieanne" w:date="2026-06-11T08:49:00Z" w16du:dateUtc="2026-06-11T15:49:00Z"/>
+        </w:rPr>
+      </w:pPr>
+      <w:ins w:id="97" w:author="Forbes, Brieanne" w:date="2026-06-11T08:49:00Z" w16du:dateUtc="2026-06-11T15:49:00Z">
+        <w:r>
+          <w:t>M</w:t>
+        </w:r>
+      </w:ins>
+      <w:del w:id="98" w:author="Forbes, Brieanne" w:date="2026-06-11T08:49:00Z" w16du:dateUtc="2026-06-11T15:49:00Z">
+        <w:r>
+          <w:delText>m</w:delText>
+        </w:r>
+      </w:del>
+      <w:r>
+        <w:t>olecular richness</w:t>
       </w:r>
     </w:p>
     <w:p>
-      <w:r>
-        <w:t>βNTI</w:t>
-      </w:r>
+      <w:pPr>
+        <w:spacing w:after="0"/>
+      </w:pPr>
+      <w:ins w:id="99" w:author="Forbes, Brieanne" w:date="2026-06-11T08:49:00Z" w16du:dateUtc="2026-06-11T15:49:00Z">
+        <w:r>
+          <w:t>B</w:t>
+        </w:r>
+        <w:r>
+          <w:t>eta nearest taxon index</w:t>
+        </w:r>
+      </w:ins>
     </w:p>
     <w:p>
-      <w:r>
-        <w:t>βMNTD</w:t>
-      </w:r>
+      <w:pPr>
+        <w:spacing w:after="0"/>
+        <w:rPr>
+          <w:del w:id="100" w:author="Forbes, Brieanne" w:date="2026-06-11T08:49:00Z" w16du:dateUtc="2026-06-11T15:49:00Z"/>
+        </w:rPr>
+      </w:pPr>
+      <w:del w:id="101" w:author="Forbes, Brieanne" w:date="2026-06-11T08:49:00Z" w16du:dateUtc="2026-06-11T15:49:00Z">
+        <w:r>
+          <w:delText>presence/absence peak table</w:delText>
+        </w:r>
+      </w:del>
     </w:p>
     <w:p>
-      <w:r>
-        <w:t>Jaccard distance</w:t>
+      <w:pPr>
+        <w:spacing w:after="0"/>
+        <w:rPr>
+          <w:ins w:id="102" w:author="Forbes, Brieanne" w:date="2026-06-11T08:50:00Z" w16du:dateUtc="2026-06-11T15:50:00Z"/>
+        </w:rPr>
+      </w:pPr>
+      <w:r>
+        <w:t>βNTI</w:t>
       </w:r>
     </w:p>
     <w:p>
-      <w:r>
-        <w:t>chloride</w:t>
-      </w:r>
+      <w:pPr>
+        <w:spacing w:after="0"/>
+      </w:pPr>
+      <w:ins w:id="103" w:author="Forbes, Brieanne" w:date="2026-06-11T08:50:00Z" w16du:dateUtc="2026-06-11T15:50:00Z">
+        <w:r>
+          <w:t xml:space="preserve">Beta </w:t>
+        </w:r>
+      </w:ins>
+      <w:ins w:id="104" w:author="Forbes, Brieanne" w:date="2026-06-11T08:50:00Z">
+        <w:r>
+          <w:t>mean nearest taxon distance</w:t>
+        </w:r>
+      </w:ins>
     </w:p>
     <w:p>
-      <w:r>
-        <w:t>nitrate</w:t>
+      <w:pPr>
+        <w:spacing w:after="0"/>
+      </w:pPr>
+      <w:r>
+        <w:t>βMNTD</w:t>
       </w:r>
     </w:p>
     <w:p>
-      <w:r>
-        <w:t>sulfate</w:t>
+      <w:pPr>
+        <w:spacing w:after="0"/>
+      </w:pPr>
+      <w:r>
+        <w:t>Jaccard distance</w:t>
       </w:r>
     </w:p>
     <w:p>
-      <w:r>
-        <w:t>non-purgeable organic carbon (NPOC)</w:t>
+      <w:pPr>
+        <w:spacing w:after="0"/>
+      </w:pPr>
+      <w:ins w:id="105" w:author="Forbes, Brieanne" w:date="2026-06-11T08:50:00Z" w16du:dateUtc="2026-06-11T15:50:00Z">
+        <w:r>
+          <w:t>C</w:t>
+        </w:r>
+      </w:ins>
+      <w:del w:id="106" w:author="Forbes, Brieanne" w:date="2026-06-11T08:50:00Z" w16du:dateUtc="2026-06-11T15:50:00Z">
+        <w:r>
+          <w:delText>c</w:delText>
+        </w:r>
+      </w:del>
+      <w:r>
+        <w:t>hloride</w:t>
       </w:r>
     </w:p>
     <w:p>
-      <w:r>
-        <w:t>total dissolved nitrogen (TN)</w:t>
+      <w:pPr>
+        <w:spacing w:after="0"/>
+      </w:pPr>
+      <w:ins w:id="107" w:author="Forbes, Brieanne" w:date="2026-06-11T08:50:00Z" w16du:dateUtc="2026-06-11T15:50:00Z">
+        <w:r>
+          <w:t>N</w:t>
+        </w:r>
+      </w:ins>
+      <w:del w:id="108" w:author="Forbes, Brieanne" w:date="2026-06-11T08:50:00Z" w16du:dateUtc="2026-06-11T15:50:00Z">
+        <w:r>
+          <w:delText>n</w:delText>
+        </w:r>
+      </w:del>
+      <w:r>
+        <w:t>itrate</w:t>
       </w:r>
     </w:p>
     <w:p>
-      <w:r>
-        <w:t>dissolved inorganic carbon (DIC)</w:t>
+      <w:pPr>
+        <w:spacing w:after="0"/>
+      </w:pPr>
+      <w:ins w:id="109" w:author="Forbes, Brieanne" w:date="2026-06-11T08:50:00Z" w16du:dateUtc="2026-06-11T15:50:00Z">
+        <w:r>
+          <w:t>S</w:t>
+        </w:r>
+      </w:ins>
+      <w:del w:id="110" w:author="Forbes, Brieanne" w:date="2026-06-11T08:50:00Z" w16du:dateUtc="2026-06-11T15:50:00Z">
+        <w:r>
+          <w:delText>s</w:delText>
+        </w:r>
+      </w:del>
+      <w:r>
+        <w:t>ulfate</w:t>
       </w:r>
     </w:p>
     <w:p>
-      <w:r>
-        <w:t>total suspended solids (TSS)</w:t>
+      <w:pPr>
+        <w:spacing w:after="0"/>
+        <w:rPr>
+          <w:ins w:id="111" w:author="Forbes, Brieanne" w:date="2026-06-11T08:50:00Z" w16du:dateUtc="2026-06-11T15:50:00Z"/>
+        </w:rPr>
+      </w:pPr>
+      <w:ins w:id="112" w:author="Forbes, Brieanne" w:date="2026-06-11T08:50:00Z" w16du:dateUtc="2026-06-11T15:50:00Z">
+        <w:r>
+          <w:t>N</w:t>
+        </w:r>
+      </w:ins>
+      <w:del w:id="113" w:author="Forbes, Brieanne" w:date="2026-06-11T08:50:00Z" w16du:dateUtc="2026-06-11T15:50:00Z">
+        <w:r>
+          <w:delText>n</w:delText>
+        </w:r>
+      </w:del>
+      <w:r>
+        <w:t>on-purgeable organic carbon</w:t>
       </w:r>
     </w:p>
     <w:p>
-      <w:r>
-        <w:t>stream order</w:t>
-      </w:r>
+      <w:pPr>
+        <w:spacing w:after="0"/>
+        <w:rPr>
+          <w:ins w:id="114" w:author="Forbes, Brieanne" w:date="2026-06-11T08:55:00Z" w16du:dateUtc="2026-06-11T15:55:00Z"/>
+        </w:rPr>
+      </w:pPr>
+      <w:del w:id="115" w:author="Forbes, Brieanne" w:date="2026-06-11T08:50:00Z" w16du:dateUtc="2026-06-11T15:50:00Z">
+        <w:r>
+          <w:delText xml:space="preserve"> (</w:delText>
+        </w:r>
+      </w:del>
+      <w:r>
+        <w:t>NPOC</w:t>
+      </w:r>
+      <w:del w:id="116" w:author="Forbes, Brieanne" w:date="2026-06-11T08:50:00Z" w16du:dateUtc="2026-06-11T15:50:00Z">
+        <w:r>
+          <w:delText>)</w:delText>
+        </w:r>
+      </w:del>
     </w:p>
     <w:p>
-      <w:r>
-        <w:t>drainage area</w:t>
-      </w:r>
+      <w:pPr>
+        <w:spacing w:after="0"/>
+        <w:rPr>
+          <w:ins w:id="117" w:author="Forbes, Brieanne" w:date="2026-06-11T08:56:00Z" w16du:dateUtc="2026-06-11T15:56:00Z"/>
+        </w:rPr>
+      </w:pPr>
+      <w:ins w:id="118" w:author="Forbes, Brieanne" w:date="2026-06-11T08:55:00Z" w16du:dateUtc="2026-06-11T15:55:00Z">
+        <w:r>
+          <w:t>Dis</w:t>
+        </w:r>
+      </w:ins>
+      <w:ins w:id="119" w:author="Forbes, Brieanne" w:date="2026-06-11T08:56:00Z" w16du:dateUtc="2026-06-11T15:56:00Z">
+        <w:r>
+          <w:t>solved organic carbon</w:t>
+        </w:r>
+      </w:ins>
     </w:p>
     <w:p>
-      <w:r>
-        <w:t>basin area</w:t>
-      </w:r>
+      <w:pPr>
+        <w:spacing w:after="0"/>
+      </w:pPr>
+      <w:ins w:id="120" w:author="Forbes, Brieanne" w:date="2026-06-11T08:56:00Z" w16du:dateUtc="2026-06-11T15:56:00Z">
+        <w:r>
+          <w:t>DOC</w:t>
+        </w:r>
+      </w:ins>
     </w:p>
     <w:p>
-      <w:r>
-        <w:t>land cover</w:t>
+      <w:pPr>
+        <w:spacing w:after="0"/>
+        <w:rPr>
+          <w:ins w:id="121" w:author="Forbes, Brieanne" w:date="2026-06-11T08:50:00Z" w16du:dateUtc="2026-06-11T15:50:00Z"/>
+        </w:rPr>
+      </w:pPr>
+      <w:ins w:id="122" w:author="Forbes, Brieanne" w:date="2026-06-11T08:50:00Z" w16du:dateUtc="2026-06-11T15:50:00Z">
+        <w:r>
+          <w:t>T</w:t>
+        </w:r>
+      </w:ins>
+      <w:del w:id="123" w:author="Forbes, Brieanne" w:date="2026-06-11T08:50:00Z" w16du:dateUtc="2026-06-11T15:50:00Z">
+        <w:r>
+          <w:delText>t</w:delText>
+        </w:r>
+      </w:del>
+      <w:r>
+        <w:t>otal dissolved nitrogen</w:t>
       </w:r>
     </w:p>
     <w:p>
-      <w:r>
-        <w:lastRenderedPageBreak/>
-        <w:t>agriculture coverage</w:t>
-      </w:r>
+      <w:pPr>
+        <w:spacing w:after="0"/>
+      </w:pPr>
+      <w:del w:id="124" w:author="Forbes, Brieanne" w:date="2026-06-11T08:50:00Z" w16du:dateUtc="2026-06-11T15:50:00Z">
+        <w:r>
+          <w:delText xml:space="preserve"> (</w:delText>
+        </w:r>
+      </w:del>
+      <w:r>
+        <w:t>TN</w:t>
+      </w:r>
+      <w:del w:id="125" w:author="Forbes, Brieanne" w:date="2026-06-11T08:50:00Z" w16du:dateUtc="2026-06-11T15:50:00Z">
+        <w:r>
+          <w:delText>)</w:delText>
+        </w:r>
+      </w:del>
     </w:p>
     <w:p>
-      <w:r>
-        <w:t>forest coverage</w:t>
+      <w:pPr>
+        <w:spacing w:after="0"/>
+        <w:rPr>
+          <w:ins w:id="126" w:author="Forbes, Brieanne" w:date="2026-06-11T08:50:00Z" w16du:dateUtc="2026-06-11T15:50:00Z"/>
+        </w:rPr>
+      </w:pPr>
+      <w:ins w:id="127" w:author="Forbes, Brieanne" w:date="2026-06-11T08:50:00Z" w16du:dateUtc="2026-06-11T15:50:00Z">
+        <w:r>
+          <w:t>D</w:t>
+        </w:r>
+      </w:ins>
+      <w:del w:id="128" w:author="Forbes, Brieanne" w:date="2026-06-11T08:50:00Z" w16du:dateUtc="2026-06-11T15:50:00Z">
+        <w:r>
+          <w:delText>d</w:delText>
+        </w:r>
+      </w:del>
+      <w:r>
+        <w:t>issolved inorganic carbon</w:t>
       </w:r>
     </w:p>
     <w:p>
-      <w:r>
-        <w:t>shrub coverage</w:t>
-      </w:r>
+      <w:pPr>
+        <w:spacing w:after="0"/>
+      </w:pPr>
+      <w:del w:id="129" w:author="Forbes, Brieanne" w:date="2026-06-11T08:50:00Z" w16du:dateUtc="2026-06-11T15:50:00Z">
+        <w:r>
+          <w:delText xml:space="preserve"> (</w:delText>
+        </w:r>
+      </w:del>
+      <w:r>
+        <w:t>DIC</w:t>
+      </w:r>
+      <w:del w:id="130" w:author="Forbes, Brieanne" w:date="2026-06-11T08:50:00Z" w16du:dateUtc="2026-06-11T15:50:00Z">
+        <w:r>
+          <w:delText>)</w:delText>
+        </w:r>
+      </w:del>
     </w:p>
     <w:p>
-      <w:r>
-        <w:t>urban coverage</w:t>
+      <w:pPr>
+        <w:spacing w:after="0"/>
+        <w:rPr>
+          <w:ins w:id="131" w:author="Forbes, Brieanne" w:date="2026-06-11T08:50:00Z" w16du:dateUtc="2026-06-11T15:50:00Z"/>
+        </w:rPr>
+      </w:pPr>
+      <w:ins w:id="132" w:author="Forbes, Brieanne" w:date="2026-06-11T08:50:00Z" w16du:dateUtc="2026-06-11T15:50:00Z">
+        <w:r>
+          <w:t>T</w:t>
+        </w:r>
+      </w:ins>
+      <w:del w:id="133" w:author="Forbes, Brieanne" w:date="2026-06-11T08:50:00Z" w16du:dateUtc="2026-06-11T15:50:00Z">
+        <w:r>
+          <w:delText>t</w:delText>
+        </w:r>
+      </w:del>
+      <w:r>
+        <w:t>otal suspended solids</w:t>
       </w:r>
     </w:p>
     <w:p>
-      <w:r>
-        <w:t>precipitation</w:t>
-      </w:r>
+      <w:pPr>
+        <w:spacing w:after="0"/>
+      </w:pPr>
+      <w:del w:id="134" w:author="Forbes, Brieanne" w:date="2026-06-11T08:50:00Z" w16du:dateUtc="2026-06-11T15:50:00Z">
+        <w:r>
+          <w:delText xml:space="preserve"> (</w:delText>
+        </w:r>
+      </w:del>
+      <w:r>
+        <w:t>TSS</w:t>
+      </w:r>
+      <w:del w:id="135" w:author="Forbes, Brieanne" w:date="2026-06-11T08:50:00Z" w16du:dateUtc="2026-06-11T15:50:00Z">
+        <w:r>
+          <w:delText>)</w:delText>
+        </w:r>
+      </w:del>
     </w:p>
     <w:p>
-      <w:r>
-        <w:t>temperature</w:t>
+      <w:pPr>
+        <w:spacing w:after="0"/>
+      </w:pPr>
+      <w:ins w:id="136" w:author="Forbes, Brieanne" w:date="2026-06-11T08:50:00Z" w16du:dateUtc="2026-06-11T15:50:00Z">
+        <w:r>
+          <w:t>S</w:t>
+        </w:r>
+      </w:ins>
+      <w:del w:id="137" w:author="Forbes, Brieanne" w:date="2026-06-11T08:50:00Z" w16du:dateUtc="2026-06-11T15:50:00Z">
+        <w:r>
+          <w:delText>s</w:delText>
+        </w:r>
+      </w:del>
+      <w:r>
+        <w:t>tream order</w:t>
       </w:r>
     </w:p>
     <w:p>
-      <w:r>
-        <w:t>potential evapotranspiration</w:t>
+      <w:pPr>
+        <w:spacing w:after="0"/>
+      </w:pPr>
+      <w:ins w:id="138" w:author="Forbes, Brieanne" w:date="2026-06-11T08:50:00Z" w16du:dateUtc="2026-06-11T15:50:00Z">
+        <w:r>
+          <w:t>D</w:t>
+        </w:r>
+      </w:ins>
+      <w:del w:id="139" w:author="Forbes, Brieanne" w:date="2026-06-11T08:50:00Z" w16du:dateUtc="2026-06-11T15:50:00Z">
+        <w:r>
+          <w:delText>d</w:delText>
+        </w:r>
+      </w:del>
+      <w:r>
+        <w:t>rainage area</w:t>
       </w:r>
     </w:p>
     <w:p>
-      <w:r>
-        <w:t>actual evapotranspiration</w:t>
+      <w:pPr>
+        <w:spacing w:after="0"/>
+      </w:pPr>
+      <w:ins w:id="140" w:author="Forbes, Brieanne" w:date="2026-06-11T08:51:00Z" w16du:dateUtc="2026-06-11T15:51:00Z">
+        <w:r>
+          <w:t>B</w:t>
+        </w:r>
+      </w:ins>
+      <w:del w:id="141" w:author="Forbes, Brieanne" w:date="2026-06-11T08:50:00Z" w16du:dateUtc="2026-06-11T15:50:00Z">
+        <w:r>
+          <w:delText>b</w:delText>
+        </w:r>
+      </w:del>
+      <w:r>
+        <w:t>asin area</w:t>
       </w:r>
     </w:p>
     <w:p>
-      <w:r>
-        <w:t>contact time</w:t>
+      <w:pPr>
+        <w:spacing w:after="0"/>
+      </w:pPr>
+      <w:ins w:id="142" w:author="Forbes, Brieanne" w:date="2026-06-11T08:51:00Z" w16du:dateUtc="2026-06-11T15:51:00Z">
+        <w:r>
+          <w:t>L</w:t>
+        </w:r>
+      </w:ins>
+      <w:del w:id="143" w:author="Forbes, Brieanne" w:date="2026-06-11T08:51:00Z" w16du:dateUtc="2026-06-11T15:51:00Z">
+        <w:r>
+          <w:delText>l</w:delText>
+        </w:r>
+      </w:del>
+      <w:r>
+        <w:t>and cover</w:t>
       </w:r>
     </w:p>
     <w:p>
-      <w:r>
-        <w:t>recharge rate</w:t>
-      </w:r>
+      <w:pPr>
+        <w:spacing w:after="0"/>
+      </w:pPr>
+      <w:ins w:id="144" w:author="Forbes, Brieanne" w:date="2026-06-11T08:51:00Z" w16du:dateUtc="2026-06-11T15:51:00Z">
+        <w:r>
+          <w:t>A</w:t>
+        </w:r>
+      </w:ins>
+      <w:del w:id="145" w:author="Forbes, Brieanne" w:date="2026-06-11T08:51:00Z" w16du:dateUtc="2026-06-11T15:51:00Z">
+        <w:r>
+          <w:delText>a</w:delText>
+        </w:r>
+      </w:del>
+      <w:r>
+        <w:t>griculture coverage</w:t>
+      </w:r>
+    </w:p>
+    <w:p>
+      <w:pPr>
+        <w:spacing w:after="0"/>
+      </w:pPr>
+      <w:ins w:id="146" w:author="Forbes, Brieanne" w:date="2026-06-11T08:51:00Z" w16du:dateUtc="2026-06-11T15:51:00Z">
+        <w:r>
+          <w:t>F</w:t>
+        </w:r>
+      </w:ins>
+      <w:del w:id="147" w:author="Forbes, Brieanne" w:date="2026-06-11T08:51:00Z" w16du:dateUtc="2026-06-11T15:51:00Z">
+        <w:r>
+          <w:delText>f</w:delText>
+        </w:r>
+      </w:del>
+      <w:r>
+        <w:t>orest coverage</w:t>
+      </w:r>
+    </w:p>
+    <w:p>
+      <w:pPr>
+        <w:spacing w:after="0"/>
+      </w:pPr>
+      <w:ins w:id="148" w:author="Forbes, Brieanne" w:date="2026-06-11T08:51:00Z" w16du:dateUtc="2026-06-11T15:51:00Z">
+        <w:r>
+          <w:t>S</w:t>
+        </w:r>
+      </w:ins>
+      <w:del w:id="149" w:author="Forbes, Brieanne" w:date="2026-06-11T08:51:00Z" w16du:dateUtc="2026-06-11T15:51:00Z">
+        <w:r>
+          <w:delText>s</w:delText>
+        </w:r>
+      </w:del>
+      <w:r>
+        <w:t>hrub coverage</w:t>
+      </w:r>
+    </w:p>
+    <w:p>
+      <w:pPr>
+        <w:spacing w:after="0"/>
+      </w:pPr>
+      <w:ins w:id="150" w:author="Forbes, Brieanne" w:date="2026-06-11T08:51:00Z" w16du:dateUtc="2026-06-11T15:51:00Z">
+        <w:r>
+          <w:t>U</w:t>
+        </w:r>
+      </w:ins>
+      <w:del w:id="151" w:author="Forbes, Brieanne" w:date="2026-06-11T08:51:00Z" w16du:dateUtc="2026-06-11T15:51:00Z">
+        <w:r>
+          <w:delText>u</w:delText>
+        </w:r>
+      </w:del>
+      <w:r>
+        <w:t>rban coverage</w:t>
+      </w:r>
+    </w:p>
+    <w:p>
+      <w:pPr>
+        <w:spacing w:after="0"/>
+      </w:pPr>
+      <w:ins w:id="152" w:author="Forbes, Brieanne" w:date="2026-06-11T08:51:00Z" w16du:dateUtc="2026-06-11T15:51:00Z">
+        <w:r>
+          <w:t>P</w:t>
+        </w:r>
+      </w:ins>
+      <w:del w:id="153" w:author="Forbes, Brieanne" w:date="2026-06-11T08:51:00Z" w16du:dateUtc="2026-06-11T15:51:00Z">
+        <w:r>
+          <w:delText>p</w:delText>
+        </w:r>
+      </w:del>
+      <w:r>
+        <w:t>recipitation</w:t>
+      </w:r>
+    </w:p>
+    <w:p>
+      <w:pPr>
+        <w:spacing w:after="0"/>
+      </w:pPr>
+      <w:ins w:id="154" w:author="Forbes, Brieanne" w:date="2026-06-11T08:51:00Z" w16du:dateUtc="2026-06-11T15:51:00Z">
+        <w:r>
+          <w:t>T</w:t>
+        </w:r>
+      </w:ins>
+      <w:del w:id="155" w:author="Forbes, Brieanne" w:date="2026-06-11T08:51:00Z" w16du:dateUtc="2026-06-11T15:51:00Z">
+        <w:r>
+          <w:delText>t</w:delText>
+        </w:r>
+      </w:del>
+      <w:r>
+        <w:t>emperature</w:t>
+      </w:r>
+    </w:p>
+    <w:p>
+      <w:pPr>
+        <w:spacing w:after="0"/>
+      </w:pPr>
+      <w:ins w:id="156" w:author="Forbes, Brieanne" w:date="2026-06-11T08:51:00Z" w16du:dateUtc="2026-06-11T15:51:00Z">
+        <w:r>
+          <w:t>P</w:t>
+        </w:r>
+      </w:ins>
+      <w:del w:id="157" w:author="Forbes, Brieanne" w:date="2026-06-11T08:51:00Z" w16du:dateUtc="2026-06-11T15:51:00Z">
+        <w:r>
+          <w:delText>p</w:delText>
+        </w:r>
+      </w:del>
+      <w:r>
+        <w:t>otential evapotranspiration</w:t>
+      </w:r>
+    </w:p>
+    <w:p>
+      <w:pPr>
+        <w:spacing w:after="0"/>
+      </w:pPr>
+      <w:ins w:id="158" w:author="Forbes, Brieanne" w:date="2026-06-11T08:51:00Z" w16du:dateUtc="2026-06-11T15:51:00Z">
+        <w:r>
+          <w:t>A</w:t>
+        </w:r>
+      </w:ins>
+      <w:del w:id="159" w:author="Forbes, Brieanne" w:date="2026-06-11T08:51:00Z" w16du:dateUtc="2026-06-11T15:51:00Z">
+        <w:r>
+          <w:delText>a</w:delText>
+        </w:r>
+      </w:del>
+      <w:r>
+        <w:t>ctual evapotranspiration</w:t>
+      </w:r>
+    </w:p>
+    <w:p>
+      <w:pPr>
+        <w:spacing w:after="0"/>
+      </w:pPr>
+      <w:ins w:id="160" w:author="Forbes, Brieanne" w:date="2026-06-11T08:51:00Z" w16du:dateUtc="2026-06-11T15:51:00Z">
+        <w:r>
+          <w:t>C</w:t>
+        </w:r>
+      </w:ins>
+      <w:del w:id="161" w:author="Forbes, Brieanne" w:date="2026-06-11T08:51:00Z" w16du:dateUtc="2026-06-11T15:51:00Z">
+        <w:r>
+          <w:delText>c</w:delText>
+        </w:r>
+      </w:del>
+      <w:r>
+        <w:t>ontact time</w:t>
+      </w:r>
+    </w:p>
+    <w:p>
+      <w:pPr>
+        <w:spacing w:after="0"/>
+      </w:pPr>
+      <w:ins w:id="162" w:author="Forbes, Brieanne" w:date="2026-06-11T08:51:00Z" w16du:dateUtc="2026-06-11T15:51:00Z">
+        <w:r>
+          <w:t>R</w:t>
+        </w:r>
+      </w:ins>
+      <w:del w:id="163" w:author="Forbes, Brieanne" w:date="2026-06-11T08:51:00Z" w16du:dateUtc="2026-06-11T15:51:00Z">
+        <w:r>
+          <w:delText>r</w:delText>
+        </w:r>
+      </w:del>
+      <w:r>
+        <w:t>echarge rate</w:t>
+      </w:r>
+    </w:p>
+    <w:p>
+      <w:pPr>
+        <w:spacing w:after="0"/>
+      </w:pPr>
     </w:p>
     <w:p>
       <w:r>
@@ -394,6 +1430,7 @@
         <w:rPr>
           <w:b/>
         </w:rPr>
+        <w:lastRenderedPageBreak/>
         <w:t>Related reference:</w:t>
       </w:r>
       <w:r>
@@ -401,43 +1438,61 @@
         <w:t>Agarwal, D., Cholia, S., Hendrix, V. C., Crystal-Ornelas, R., Snavely, C., Damerow, J., &amp; Varadharajan. (2022). ESS-DIVE Reporting Format for Dataset Metadata. Environmental Systems Science Data Infrastructure for a Virtual Ecosystem (ESS-DIVE), ESS-DIVE repository. https://doi.org/10.15485/1866026</w:t>
       </w:r>
     </w:p>
-    <w:p/>
     <w:p>
       <w:r>
         <w:t>Danczak, R. E., Garayburu-Caruso, V. A., Renteria, L., Otenburg, O. C., Son, K., Kaufman, M. H., Barnes, M. E., Forbes, B., &amp; Stegen, J. C. Non-random processes impacting organic matter chemistry are maximized in mid-order streams. Manuscript submitted to Science Advances. TODO: add publication year, volume/pages, and DOI when available.</w:t>
       </w:r>
+    </w:p>
+    <w:p>
+      <w:r>
+        <w:t>Fulton, S. G., Barnes, M., Borton, M. A., et al. (2022). Spatial Study 2021: Sensor-Based Time Series of Surface Water Temperature, Specific Conductance, Total Dissolved Solids, pH, and Dissolved Oxygen from across Multiple Watersheds in the Yakima River Basin, Washington, USA (V3). Environmental System Science Data Infrastructure for a Virtual Ecosystem. https://doi.org/10.15485/1892052</w:t>
+      </w:r>
+    </w:p>
+    <w:p>
+      <w:r>
+        <w:t>Grieger, S., Barnes, M., Borton, M. A., et al. (2022). Spatial Study 2021: Sample-Based Surface Water Chemistry and Organic Matter Characterization across Watersheds in the Yakima River Basin, Washington, USA (V2). Environmental System Science Data Infrastructure for a Virtual Ecosystem. https://doi.org/10.15485/1898914</w:t>
+      </w:r>
+    </w:p>
+    <w:p>
+      <w:r>
+        <w:t>Tolić, N., Liu, Y., Liyu, A., et al. (2017). Formularity: Software for Automated Formula Assignment of Natural and Other Organic Matter from Ultrahigh-Resolution Mass Spectra. Analytical Chemistry, 89(23), 12659–12665.</w:t>
+      </w:r>
+    </w:p>
+    <w:p>
+      <w:r>
+        <w:t>Velliquette, T., Welch, J., Crow, M., Devarakonda, R., Heinz, S., &amp; Crystal-Ornelas, R. (2021). ESS-DIVE Reporting Format for Comma-separated Values (CSV) File Structure. ESS-DIVE Repository. https://doi.org/10.15485/1734841</w:t>
+      </w:r>
+    </w:p>
+    <w:p>
+      <w:r>
+        <w:t>Velliquette, T., Welch, J., Crow, M., Devarakonda, R., Heinz, S., &amp; Crystal-Ornelas, R. (2021). ESS-</w:t>
+      </w:r>
+      <w:commentRangeStart w:id="164"/>
+      <w:r>
+        <w:t>DIVE</w:t>
+      </w:r>
+      <w:commentRangeEnd w:id="164"/>
+      <w:r>
+        <w:rPr>
+          <w:rStyle w:val="CommentReference"/>
+          <w:sz w:val="20"/>
+          <w:szCs w:val="22"/>
+        </w:rPr>
+        <w:commentReference w:id="164"/>
+      </w:r>
+      <w:r>
+        <w:t xml:space="preserve"> Reporting Format for File-level Metadata. ESS-DIVE Repository. </w:t>
+      </w:r>
+      <w:hyperlink r:id="rId10" w:history="1">
+        <w:r>
+          <w:rPr>
+            <w:rStyle w:val="Hyperlink"/>
+          </w:rPr>
+          <w:t>https://doi.org/10.15485/1734840</w:t>
+        </w:r>
+      </w:hyperlink>
     </w:p>
     <w:p/>
-    <w:p>
-      <w:r>
-        <w:t>Fulton, S. G., Barnes, M., Borton, M. A., et al. (2022). Spatial Study 2021: Sensor-Based Time Series of Surface Water Temperature, Specific Conductance, Total Dissolved Solids, pH, and Dissolved Oxygen from across Multiple Watersheds in the Yakima River Basin, Washington, USA (V3). Environmental System Science Data Infrastructure for a Virtual Ecosystem. https://doi.org/10.15485/1892052</w:t>
-      </w:r>
-    </w:p>
-    <w:p/>
-    <w:p>
-      <w:r>
-        <w:lastRenderedPageBreak/>
-        <w:t>Grieger, S., Barnes, M., Borton, M. A., et al. (2022). Spatial Study 2021: Sample-Based Surface Water Chemistry and Organic Matter Characterization across Watersheds in the Yakima River Basin, Washington, USA (V2). Environmental System Science Data Infrastructure for a Virtual Ecosystem. https://doi.org/10.15485/1898914</w:t>
-      </w:r>
-    </w:p>
-    <w:p/>
-    <w:p>
-      <w:r>
-        <w:t>Tolić, N., Liu, Y., Liyu, A., et al. (2017). Formularity: Software for Automated Formula Assignment of Natural and Other Organic Matter from Ultrahigh-Resolution Mass Spectra. Analytical Chemistry, 89(23), 12659–12665.</w:t>
-      </w:r>
-    </w:p>
-    <w:p/>
-    <w:p>
-      <w:r>
-        <w:t>Velliquette, T., Welch, J., Crow, M., Devarakonda, R., Heinz, S., &amp; Crystal-Ornelas, R. (2021). ESS-DIVE Reporting Format for Comma-separated Values (CSV) File Structure. ESS-DIVE Repository. https://doi.org/10.15485/1734841</w:t>
-      </w:r>
-    </w:p>
-    <w:p/>
-    <w:p>
-      <w:r>
-        <w:t>Velliquette, T., Welch, J., Crow, M., Devarakonda, R., Heinz, S., &amp; Crystal-Ornelas, R. (2021). ESS-DIVE Reporting Format for File-level Metadata. ESS-DIVE Repository. https://doi.org/10.15485/1734840</w:t>
-      </w:r>
-    </w:p>
     <w:p>
       <w:r>
         <w:rPr>
@@ -451,6 +1506,7 @@
       </w:r>
     </w:p>
     <w:p>
+      <w:commentRangeStart w:id="165"/>
       <w:r>
         <w:rPr>
           <w:b/>
@@ -473,8 +1529,20 @@
         <w:br/>
         <w:t>robert.danczak@pnnl.gov; vanessa.garayburu-caruso@pnnl.gov</w:t>
       </w:r>
+      <w:commentRangeEnd w:id="165"/>
+      <w:r>
+        <w:rPr>
+          <w:rStyle w:val="CommentReference"/>
+          <w:sz w:val="20"/>
+          <w:szCs w:val="22"/>
+        </w:rPr>
+        <w:commentReference w:id="165"/>
+      </w:r>
     </w:p>
     <w:p>
+      <w:pPr>
+        <w:spacing w:after="0"/>
+      </w:pPr>
       <w:r>
         <w:rPr>
           <w:b/>
@@ -483,48 +1551,79 @@
       </w:r>
       <w:r>
         <w:br/>
-        <w:t>Robert E. Danczak</w:t>
+      </w:r>
+      <w:r>
+        <w:t>Vanessa A. Garayburu-Caruso</w:t>
       </w:r>
     </w:p>
     <w:p>
-      <w:r>
-        <w:t>Vanessa A. Garayburu-Caruso</w:t>
+      <w:pPr>
+        <w:spacing w:after="0"/>
+      </w:pPr>
+      <w:r>
+        <w:t>Robert E. Danczak</w:t>
       </w:r>
     </w:p>
     <w:p>
+      <w:pPr>
+        <w:spacing w:after="0"/>
+      </w:pPr>
       <w:r>
         <w:t>Lupita Renteria</w:t>
       </w:r>
     </w:p>
     <w:p>
+      <w:pPr>
+        <w:spacing w:after="0"/>
+      </w:pPr>
       <w:r>
         <w:t>Opal C. Otenburg</w:t>
       </w:r>
     </w:p>
     <w:p>
+      <w:pPr>
+        <w:spacing w:after="0"/>
+      </w:pPr>
       <w:r>
         <w:t>Kyongho Son</w:t>
       </w:r>
     </w:p>
     <w:p>
+      <w:pPr>
+        <w:spacing w:after="0"/>
+      </w:pPr>
       <w:r>
         <w:t>Matthew H. Kaufman</w:t>
       </w:r>
     </w:p>
     <w:p>
+      <w:pPr>
+        <w:spacing w:after="0"/>
+      </w:pPr>
       <w:r>
         <w:t>Morgan E. Barnes</w:t>
       </w:r>
     </w:p>
     <w:p>
+      <w:pPr>
+        <w:spacing w:after="0"/>
+      </w:pPr>
       <w:r>
         <w:t>Brieanne Forbes</w:t>
       </w:r>
     </w:p>
     <w:p>
+      <w:pPr>
+        <w:spacing w:after="0"/>
+      </w:pPr>
       <w:r>
         <w:t>James C. Stegen</w:t>
       </w:r>
+    </w:p>
+    <w:p>
+      <w:pPr>
+        <w:spacing w:after="0"/>
+      </w:pPr>
     </w:p>
     <w:p>
       <w:r>
@@ -537,18 +1636,47 @@
         <w:br/>
         <w:t>2021-08</w:t>
       </w:r>
+      <w:ins w:id="166" w:author="Forbes, Brieanne" w:date="2026-06-11T08:53:00Z" w16du:dateUtc="2026-06-11T15:53:00Z">
+        <w:r>
+          <w:t>-30</w:t>
+        </w:r>
+      </w:ins>
     </w:p>
     <w:p>
       <w:r>
         <w:rPr>
           <w:b/>
         </w:rPr>
+        <w:lastRenderedPageBreak/>
         <w:t>End date:</w:t>
       </w:r>
       <w:r>
         <w:br/>
-        <w:t>2021-08</w:t>
-      </w:r>
+        <w:t>2021-0</w:t>
+      </w:r>
+      <w:ins w:id="167" w:author="Forbes, Brieanne" w:date="2026-06-11T08:53:00Z" w16du:dateUtc="2026-06-11T15:53:00Z">
+        <w:r>
+          <w:t>9-</w:t>
+        </w:r>
+        <w:commentRangeStart w:id="168"/>
+        <w:r>
+          <w:t>15</w:t>
+        </w:r>
+      </w:ins>
+      <w:commentRangeEnd w:id="168"/>
+      <w:r>
+        <w:rPr>
+          <w:rStyle w:val="CommentReference"/>
+          <w:sz w:val="20"/>
+          <w:szCs w:val="22"/>
+        </w:rPr>
+        <w:commentReference w:id="168"/>
+      </w:r>
+      <w:del w:id="169" w:author="Forbes, Brieanne" w:date="2026-06-11T08:53:00Z" w16du:dateUtc="2026-06-11T15:53:00Z">
+        <w:r>
+          <w:delText>8</w:delText>
+        </w:r>
+      </w:del>
     </w:p>
     <w:p>
       <w:r>
@@ -559,7 +1687,20 @@
       </w:r>
       <w:r>
         <w:br/>
-        <w:t>Yakima River Basin, Washington, USA; refer to metadata spreadsheet</w:t>
+        <w:t xml:space="preserve">Yakima River Basin, Washington, USA; refer to metadata </w:t>
+      </w:r>
+      <w:commentRangeStart w:id="170"/>
+      <w:r>
+        <w:t>spreadsheet</w:t>
+      </w:r>
+      <w:commentRangeEnd w:id="170"/>
+      <w:r>
+        <w:rPr>
+          <w:rStyle w:val="CommentReference"/>
+          <w:sz w:val="20"/>
+          <w:szCs w:val="22"/>
+        </w:rPr>
+        <w:commentReference w:id="170"/>
       </w:r>
     </w:p>
     <w:p>
@@ -567,7 +1708,6 @@
         <w:rPr>
           <w:b/>
         </w:rPr>
-        <w:lastRenderedPageBreak/>
         <w:t>Coordinates:</w:t>
       </w:r>
       <w:r>
@@ -584,7 +1724,146 @@
       </w:r>
       <w:r>
         <w:br/>
-        <w:t>For a full description of the methods, see the Methods section of Danczak et al. (in review). Briefly, surface-water samples and site metadata were collected from 47 Yakima River Basin sites spanning stream orders, land uses, and environmental conditions during August 2021. Filtered water samples were analyzed for chloride, nitrate, and sulfate by ion chromatography; non-purgeable organic carbon (NPOC), total dissolved nitrogen (TN), and dissolved inorganic carbon (DIC) using a Shimadzu TOC-L analyzer; and total suspended solids (TSS) from unfiltered water. DOM samples were normalized to 1.5 mg C L−1, extracted with PPL cartridges, and analyzed by 12 T FTICR-MS at EMSL. Molecular formulae were assigned using Formultitude and processed with ftmsRanalysis; triplicate samples were merged conservatively by retaining peaks present in all replicates and converting peak intensities to binary presence/absence. Geospatial attributes were extracted using NHDPlus v2, and R scripts were used to calculate DOM richness, beta diversity, molecular characteristics dendrograms, and β-nearest taxon index (βNTI) null-model metrics to evaluate deterministic and stochastic assembly processes.</w:t>
+        <w:t xml:space="preserve">For a full description of the methods, see the </w:t>
+      </w:r>
+      <w:del w:id="171" w:author="Forbes, Brieanne" w:date="2026-06-11T08:54:00Z" w16du:dateUtc="2026-06-11T15:54:00Z">
+        <w:r>
+          <w:delText>Methods section of Danczak et al. (in review)</w:delText>
+        </w:r>
+      </w:del>
+      <w:ins w:id="172" w:author="Forbes, Brieanne" w:date="2026-06-11T08:54:00Z" w16du:dateUtc="2026-06-11T15:54:00Z">
+        <w:r>
+          <w:t>associated manuscript</w:t>
+        </w:r>
+      </w:ins>
+      <w:r>
+        <w:t>. Briefly, surface-water samples and site metadata were collected from 47 Yakima River Basin sites spanning stream orders, land uses, and environmental conditions during August</w:t>
+      </w:r>
+      <w:ins w:id="173" w:author="Forbes, Brieanne" w:date="2026-06-11T08:55:00Z" w16du:dateUtc="2026-06-11T15:55:00Z">
+        <w:r>
+          <w:t xml:space="preserve"> and September</w:t>
+        </w:r>
+      </w:ins>
+      <w:r>
+        <w:t xml:space="preserve"> 2021. Filtered water samples were analyzed for chloride, nitrate, and sulfate by ion chromatography; non-purgeable organic carbon (NPOC), total dissolved nitrogen (TN), and dissolved inorganic carbon (DIC) using a Shimadzu TOC-L analyzer; and total suspended solids (TSS) from unfiltered water. DOM samples were normalized to 1.5 </w:t>
+      </w:r>
+      <w:del w:id="174" w:author="Forbes, Brieanne" w:date="2026-06-11T08:56:00Z" w16du:dateUtc="2026-06-11T15:56:00Z">
+        <w:r>
+          <w:delText>mg C L−1</w:delText>
+        </w:r>
+      </w:del>
+      <w:ins w:id="175" w:author="Forbes, Brieanne" w:date="2026-06-11T08:56:00Z" w16du:dateUtc="2026-06-11T15:56:00Z">
+        <w:r>
+          <w:t>milligrams carbon per liter</w:t>
+        </w:r>
+      </w:ins>
+      <w:r>
+        <w:t xml:space="preserve">, extracted with </w:t>
+      </w:r>
+      <w:ins w:id="176" w:author="Forbes, Brieanne" w:date="2026-06-11T08:56:00Z" w16du:dateUtc="2026-06-11T15:56:00Z">
+        <w:r>
+          <w:t>Priority PolLutant</w:t>
+        </w:r>
+        <w:r>
+          <w:t xml:space="preserve"> (</w:t>
+        </w:r>
+      </w:ins>
+      <w:r>
+        <w:t>PPL</w:t>
+      </w:r>
+      <w:ins w:id="177" w:author="Forbes, Brieanne" w:date="2026-06-11T08:56:00Z" w16du:dateUtc="2026-06-11T15:56:00Z">
+        <w:r>
+          <w:t>)</w:t>
+        </w:r>
+      </w:ins>
+      <w:r>
+        <w:t xml:space="preserve"> cartridges, and analyzed by 12</w:t>
+      </w:r>
+      <w:del w:id="178" w:author="Forbes, Brieanne" w:date="2026-06-11T08:57:00Z" w16du:dateUtc="2026-06-11T15:57:00Z">
+        <w:r>
+          <w:delText xml:space="preserve"> </w:delText>
+        </w:r>
+      </w:del>
+      <w:r>
+        <w:t xml:space="preserve">T FTICR-MS at </w:t>
+      </w:r>
+      <w:ins w:id="179" w:author="Forbes, Brieanne" w:date="2026-06-11T08:57:00Z" w16du:dateUtc="2026-06-11T15:57:00Z">
+        <w:r>
+          <w:t xml:space="preserve">the </w:t>
+        </w:r>
+      </w:ins>
+      <w:ins w:id="180" w:author="Forbes, Brieanne" w:date="2026-06-11T08:58:00Z" w16du:dateUtc="2026-06-11T15:58:00Z">
+        <w:r>
+          <w:t>Environmental</w:t>
+        </w:r>
+      </w:ins>
+      <w:ins w:id="181" w:author="Forbes, Brieanne" w:date="2026-06-11T08:57:00Z" w16du:dateUtc="2026-06-11T15:57:00Z">
+        <w:r>
+          <w:t xml:space="preserve"> Molecular Sciences Laboratory (</w:t>
+        </w:r>
+      </w:ins>
+      <w:r>
+        <w:t>EMSL</w:t>
+      </w:r>
+      <w:ins w:id="182" w:author="Forbes, Brieanne" w:date="2026-06-11T08:57:00Z" w16du:dateUtc="2026-06-11T15:57:00Z">
+        <w:r>
+          <w:t>)</w:t>
+        </w:r>
+      </w:ins>
+      <w:r>
+        <w:t xml:space="preserve">. Molecular formulae were assigned using Formultitude </w:t>
+      </w:r>
+      <w:ins w:id="183" w:author="Forbes, Brieanne" w:date="2026-06-11T08:58:00Z">
+        <w:r>
+          <w:t>(</w:t>
+        </w:r>
+      </w:ins>
+      <w:ins w:id="184" w:author="Forbes, Brieanne" w:date="2026-06-11T08:58:00Z" w16du:dateUtc="2026-06-11T15:58:00Z">
+        <w:r>
+          <w:fldChar w:fldCharType="begin"/>
+        </w:r>
+        <w:r>
+          <w:instrText>HYPERLINK "</w:instrText>
+        </w:r>
+      </w:ins>
+      <w:ins w:id="185" w:author="Forbes, Brieanne" w:date="2026-06-11T08:58:00Z">
+        <w:r>
+          <w:instrText>https://github.com/PNNL-Comp-Mass-Spec/Formultitude</w:instrText>
+        </w:r>
+      </w:ins>
+      <w:ins w:id="186" w:author="Forbes, Brieanne" w:date="2026-06-11T08:58:00Z" w16du:dateUtc="2026-06-11T15:58:00Z">
+        <w:r>
+          <w:instrText>"</w:instrText>
+        </w:r>
+        <w:r>
+          <w:fldChar w:fldCharType="separate"/>
+        </w:r>
+      </w:ins>
+      <w:ins w:id="187" w:author="Forbes, Brieanne" w:date="2026-06-11T08:58:00Z">
+        <w:r>
+          <w:rPr>
+            <w:rStyle w:val="Hyperlink"/>
+          </w:rPr>
+          <w:t>https://github.com/PNNL-Comp-Mass-Spec/Formultitude</w:t>
+        </w:r>
+      </w:ins>
+      <w:ins w:id="188" w:author="Forbes, Brieanne" w:date="2026-06-11T08:58:00Z" w16du:dateUtc="2026-06-11T15:58:00Z">
+        <w:r>
+          <w:fldChar w:fldCharType="end"/>
+        </w:r>
+      </w:ins>
+      <w:ins w:id="189" w:author="Forbes, Brieanne" w:date="2026-06-11T08:58:00Z">
+        <w:r>
+          <w:t>)</w:t>
+        </w:r>
+      </w:ins>
+      <w:ins w:id="190" w:author="Forbes, Brieanne" w:date="2026-06-11T08:58:00Z" w16du:dateUtc="2026-06-11T15:58:00Z">
+        <w:r>
+          <w:t xml:space="preserve"> </w:t>
+        </w:r>
+      </w:ins>
+      <w:r>
+        <w:t>and processed with ftmsRanalysis; triplicate samples were merged conservatively by retaining peaks present in all replicates and converting peak intensities to binary presence/absence. Geospatial attributes were extracted using NHDPlus v2, and R scripts were used to calculate DOM richness, beta diversity, molecular characteristics dendrograms, and β-nearest taxon index (βNTI) null-model metrics to evaluate deterministic and stochastic assembly processes.</w:t>
       </w:r>
     </w:p>
     <w:p/>
@@ -596,6 +1875,121 @@
     </w:sectPr>
   </w:body>
 </w:document>
+</file>
+
+<file path=word/comments.xml><?xml version="1.0" encoding="utf-8"?>
+<w:comments xmlns:wpc="http://schemas.microsoft.com/office/word/2010/wordprocessingCanvas" xmlns:cx="http://schemas.microsoft.com/office/drawing/2014/chartex" xmlns:cx1="http://schemas.microsoft.com/office/drawing/2015/9/8/chartex" xmlns:cx2="http://schemas.microsoft.com/office/drawing/2015/10/21/chartex" xmlns:cx3="http://schemas.microsoft.com/office/drawing/2016/5/9/chartex" xmlns:cx4="http://schemas.microsoft.com/office/drawing/2016/5/10/chartex" xmlns:cx5="http://schemas.microsoft.com/office/drawing/2016/5/11/chartex" xmlns:cx6="http://schemas.microsoft.com/office/drawing/2016/5/12/chartex" xmlns:cx7="http://schemas.microsoft.com/office/drawing/2016/5/13/chartex" xmlns:cx8="http://schemas.microsoft.com/office/drawing/2016/5/14/chartex" xmlns:mc="http://schemas.openxmlformats.org/markup-compatibility/2006" xmlns:aink="http://schemas.microsoft.com/office/drawing/2016/ink" xmlns:am3d="http://schemas.microsoft.com/office/drawing/2017/model3d" xmlns:o="urn:schemas-microsoft-com:office:office" xmlns:oel="http://schemas.microsoft.com/office/2019/extlst" xmlns:r="http://schemas.openxmlformats.org/officeDocument/2006/relationships" xmlns:m="http://schemas.openxmlformats.org/officeDocument/2006/math" xmlns:v="urn:schemas-microsoft-com:vml" xmlns:wp14="http://schemas.microsoft.com/office/word/2010/wordprocessingDrawing" xmlns:wp="http://schemas.openxmlformats.org/drawingml/2006/wordprocessingDrawing" xmlns:w10="urn:schemas-microsoft-com:office:word" xmlns:w="http://schemas.openxmlformats.org/wordprocessingml/2006/main" xmlns:w14="http://schemas.microsoft.com/office/word/2010/wordml" xmlns:w15="http://schemas.microsoft.com/office/word/2012/wordml" xmlns:w16cex="http://schemas.microsoft.com/office/word/2018/wordml/cex" xmlns:w16cid="http://schemas.microsoft.com/office/word/2016/wordml/cid" xmlns:w16="http://schemas.microsoft.com/office/word/2018/wordml" xmlns:w16du="http://schemas.microsoft.com/office/word/2023/wordml/word16du" xmlns:w16sdtdh="http://schemas.microsoft.com/office/word/2020/wordml/sdtdatahash" xmlns:w16sdtfl="http://schemas.microsoft.com/office/word/2024/wordml/sdtformatlock" xmlns:w16se="http://schemas.microsoft.com/office/word/2015/wordml/symex" xmlns:wpg="http://schemas.microsoft.com/office/word/2010/wordprocessingGroup" xmlns:wpi="http://schemas.microsoft.com/office/word/2010/wordprocessingInk" xmlns:wne="http://schemas.microsoft.com/office/word/2006/wordml" xmlns:wps="http://schemas.microsoft.com/office/word/2010/wordprocessingShape" mc:Ignorable="w14 w15 w16se w16cid w16 w16cex w16sdtdh w16sdtfl w16du wp14">
+  <w:comment w:id="86" w:author="Forbes, Brieanne" w:date="2026-06-11T08:49:00Z" w:initials="BF">
+    <w:p>
+      <w:pPr>
+        <w:pStyle w:val="CommentText"/>
+      </w:pPr>
+      <w:r>
+        <w:rPr>
+          <w:rStyle w:val="CommentReference"/>
+        </w:rPr>
+        <w:annotationRef/>
+      </w:r>
+      <w:r>
+        <w:t>Add once paper is accepted</w:t>
+      </w:r>
+    </w:p>
+  </w:comment>
+  <w:comment w:id="164" w:author="Forbes, Brieanne" w:date="2026-06-11T08:51:00Z" w:initials="BF">
+    <w:p>
+      <w:pPr>
+        <w:pStyle w:val="CommentText"/>
+      </w:pPr>
+      <w:r>
+        <w:rPr>
+          <w:rStyle w:val="CommentReference"/>
+        </w:rPr>
+        <w:annotationRef/>
+      </w:r>
+      <w:r>
+        <w:t>Add once paper is accepted</w:t>
+      </w:r>
+    </w:p>
+  </w:comment>
+  <w:comment w:id="165" w:author="Forbes, Brieanne" w:date="2026-06-11T08:42:00Z" w:initials="BF">
+    <w:p>
+      <w:pPr>
+        <w:pStyle w:val="CommentText"/>
+      </w:pPr>
+      <w:r>
+        <w:rPr>
+          <w:rStyle w:val="CommentReference"/>
+        </w:rPr>
+        <w:annotationRef/>
+      </w:r>
+      <w:r>
+        <w:t>Can only add one on the landing page, I can add both in the readme when the paper is acccepted</w:t>
+      </w:r>
+    </w:p>
+  </w:comment>
+  <w:comment w:id="168" w:author="Forbes, Brieanne" w:date="2026-06-11T08:53:00Z" w:initials="BF">
+    <w:p>
+      <w:pPr>
+        <w:pStyle w:val="CommentText"/>
+      </w:pPr>
+      <w:r>
+        <w:rPr>
+          <w:rStyle w:val="CommentReference"/>
+        </w:rPr>
+        <w:annotationRef/>
+      </w:r>
+      <w:r>
+        <w:t>Pulled this from the SPS dp</w:t>
+      </w:r>
+    </w:p>
+  </w:comment>
+  <w:comment w:id="170" w:author="Forbes, Brieanne" w:date="2026-06-11T08:54:00Z" w:initials="BF">
+    <w:p>
+      <w:pPr>
+        <w:pStyle w:val="CommentText"/>
+      </w:pPr>
+      <w:r>
+        <w:rPr>
+          <w:rStyle w:val="CommentReference"/>
+        </w:rPr>
+        <w:annotationRef/>
+      </w:r>
+      <w:r>
+        <w:t xml:space="preserve">I will pull this from the SPS dp. Are there any sites you didn’t use? </w:t>
+      </w:r>
+    </w:p>
+  </w:comment>
+</w:comments>
+</file>
+
+<file path=word/commentsExtended.xml><?xml version="1.0" encoding="utf-8"?>
+<w15:commentsEx xmlns:wpc="http://schemas.microsoft.com/office/word/2010/wordprocessingCanvas" xmlns:cx="http://schemas.microsoft.com/office/drawing/2014/chartex" xmlns:cx1="http://schemas.microsoft.com/office/drawing/2015/9/8/chartex" xmlns:cx2="http://schemas.microsoft.com/office/drawing/2015/10/21/chartex" xmlns:cx3="http://schemas.microsoft.com/office/drawing/2016/5/9/chartex" xmlns:cx4="http://schemas.microsoft.com/office/drawing/2016/5/10/chartex" xmlns:cx5="http://schemas.microsoft.com/office/drawing/2016/5/11/chartex" xmlns:cx6="http://schemas.microsoft.com/office/drawing/2016/5/12/chartex" xmlns:cx7="http://schemas.microsoft.com/office/drawing/2016/5/13/chartex" xmlns:cx8="http://schemas.microsoft.com/office/drawing/2016/5/14/chartex" xmlns:mc="http://schemas.openxmlformats.org/markup-compatibility/2006" xmlns:aink="http://schemas.microsoft.com/office/drawing/2016/ink" xmlns:am3d="http://schemas.microsoft.com/office/drawing/2017/model3d" xmlns:o="urn:schemas-microsoft-com:office:office" xmlns:oel="http://schemas.microsoft.com/office/2019/extlst" xmlns:r="http://schemas.openxmlformats.org/officeDocument/2006/relationships" xmlns:m="http://schemas.openxmlformats.org/officeDocument/2006/math" xmlns:v="urn:schemas-microsoft-com:vml" xmlns:wp14="http://schemas.microsoft.com/office/word/2010/wordprocessingDrawing" xmlns:wp="http://schemas.openxmlformats.org/drawingml/2006/wordprocessingDrawing" xmlns:w10="urn:schemas-microsoft-com:office:word" xmlns:w="http://schemas.openxmlformats.org/wordprocessingml/2006/main" xmlns:w14="http://schemas.microsoft.com/office/word/2010/wordml" xmlns:w15="http://schemas.microsoft.com/office/word/2012/wordml" xmlns:w16cex="http://schemas.microsoft.com/office/word/2018/wordml/cex" xmlns:w16cid="http://schemas.microsoft.com/office/word/2016/wordml/cid" xmlns:w16="http://schemas.microsoft.com/office/word/2018/wordml" xmlns:w16du="http://schemas.microsoft.com/office/word/2023/wordml/word16du" xmlns:w16sdtdh="http://schemas.microsoft.com/office/word/2020/wordml/sdtdatahash" xmlns:w16sdtfl="http://schemas.microsoft.com/office/word/2024/wordml/sdtformatlock" xmlns:w16se="http://schemas.microsoft.com/office/word/2015/wordml/symex" xmlns:wpg="http://schemas.microsoft.com/office/word/2010/wordprocessingGroup" xmlns:wpi="http://schemas.microsoft.com/office/word/2010/wordprocessingInk" xmlns:wne="http://schemas.microsoft.com/office/word/2006/wordml" xmlns:wps="http://schemas.microsoft.com/office/word/2010/wordprocessingShape" mc:Ignorable="w14 w15 w16se w16cid w16 w16cex w16sdtdh w16sdtfl w16du wp14">
+  <w15:commentEx w15:paraId="73A41468" w15:done="0"/>
+  <w15:commentEx w15:paraId="673A0D72" w15:done="0"/>
+  <w15:commentEx w15:paraId="08F011BD" w15:done="0"/>
+  <w15:commentEx w15:paraId="7B9B8C93" w15:done="0"/>
+  <w15:commentEx w15:paraId="291697C2" w15:done="0"/>
+</w15:commentsEx>
+</file>
+
+<file path=word/commentsExtensible.xml><?xml version="1.0" encoding="utf-8"?>
+<w16cex:commentsExtensible xmlns:wpc="http://schemas.microsoft.com/office/word/2010/wordprocessingCanvas" xmlns:cx="http://schemas.microsoft.com/office/drawing/2014/chartex" xmlns:cx1="http://schemas.microsoft.com/office/drawing/2015/9/8/chartex" xmlns:cx2="http://schemas.microsoft.com/office/drawing/2015/10/21/chartex" xmlns:cx3="http://schemas.microsoft.com/office/drawing/2016/5/9/chartex" xmlns:cx4="http://schemas.microsoft.com/office/drawing/2016/5/10/chartex" xmlns:cx5="http://schemas.microsoft.com/office/drawing/2016/5/11/chartex" xmlns:cx6="http://schemas.microsoft.com/office/drawing/2016/5/12/chartex" xmlns:cx7="http://schemas.microsoft.com/office/drawing/2016/5/13/chartex" xmlns:cx8="http://schemas.microsoft.com/office/drawing/2016/5/14/chartex" xmlns:cr="http://schemas.microsoft.com/office/comments/2020/reactions" xmlns:mc="http://schemas.openxmlformats.org/markup-compatibility/2006" xmlns:aink="http://schemas.microsoft.com/office/drawing/2016/ink" xmlns:am3d="http://schemas.microsoft.com/office/drawing/2017/model3d" xmlns:o="urn:schemas-microsoft-com:office:office" xmlns:oel="http://schemas.microsoft.com/office/2019/extlst" xmlns:r="http://schemas.openxmlformats.org/officeDocument/2006/relationships" xmlns:m="http://schemas.openxmlformats.org/officeDocument/2006/math" xmlns:v="urn:schemas-microsoft-com:vml" xmlns:wp14="http://schemas.microsoft.com/office/word/2010/wordprocessingDrawing" xmlns:wp="http://schemas.openxmlformats.org/drawingml/2006/wordprocessingDrawing" xmlns:w10="urn:schemas-microsoft-com:office:word" xmlns:w="http://schemas.openxmlformats.org/wordprocessingml/2006/main" xmlns:w14="http://schemas.microsoft.com/office/word/2010/wordml" xmlns:w15="http://schemas.microsoft.com/office/word/2012/wordml" xmlns:w16cex="http://schemas.microsoft.com/office/word/2018/wordml/cex" xmlns:w16cid="http://schemas.microsoft.com/office/word/2016/wordml/cid" xmlns:w16="http://schemas.microsoft.com/office/word/2018/wordml" xmlns:w16du="http://schemas.microsoft.com/office/word/2023/wordml/word16du" xmlns:w16sdtdh="http://schemas.microsoft.com/office/word/2020/wordml/sdtdatahash" xmlns:w16sdtfl="http://schemas.microsoft.com/office/word/2024/wordml/sdtformatlock" xmlns:w16se="http://schemas.microsoft.com/office/word/2015/wordml/symex" xmlns:wpg="http://schemas.microsoft.com/office/word/2010/wordprocessingGroup" xmlns:wpi="http://schemas.microsoft.com/office/word/2010/wordprocessingInk" xmlns:wne="http://schemas.microsoft.com/office/word/2006/wordml" xmlns:wps="http://schemas.microsoft.com/office/word/2010/wordprocessingShape" mc:Ignorable="w14 w15 w16se w16cid w16 w16cex w16sdtdh w16sdtfl cr w16du wp14">
+  <w16cex:commentExtensible w16cex:durableId="63061089" w16cex:dateUtc="2026-06-11T15:49:00Z"/>
+  <w16cex:commentExtensible w16cex:durableId="706B0BCB" w16cex:dateUtc="2026-06-11T15:51:00Z"/>
+  <w16cex:commentExtensible w16cex:durableId="03164A67" w16cex:dateUtc="2026-06-11T15:42:00Z"/>
+  <w16cex:commentExtensible w16cex:durableId="340EEEED" w16cex:dateUtc="2026-06-11T15:53:00Z"/>
+  <w16cex:commentExtensible w16cex:durableId="762D13CE" w16cex:dateUtc="2026-06-11T15:54:00Z"/>
+</w16cex:commentsExtensible>
+</file>
+
+<file path=word/commentsIds.xml><?xml version="1.0" encoding="utf-8"?>
+<w16cid:commentsIds xmlns:wpc="http://schemas.microsoft.com/office/word/2010/wordprocessingCanvas" xmlns:cx="http://schemas.microsoft.com/office/drawing/2014/chartex" xmlns:cx1="http://schemas.microsoft.com/office/drawing/2015/9/8/chartex" xmlns:cx2="http://schemas.microsoft.com/office/drawing/2015/10/21/chartex" xmlns:cx3="http://schemas.microsoft.com/office/drawing/2016/5/9/chartex" xmlns:cx4="http://schemas.microsoft.com/office/drawing/2016/5/10/chartex" xmlns:cx5="http://schemas.microsoft.com/office/drawing/2016/5/11/chartex" xmlns:cx6="http://schemas.microsoft.com/office/drawing/2016/5/12/chartex" xmlns:cx7="http://schemas.microsoft.com/office/drawing/2016/5/13/chartex" xmlns:cx8="http://schemas.microsoft.com/office/drawing/2016/5/14/chartex" xmlns:mc="http://schemas.openxmlformats.org/markup-compatibility/2006" xmlns:aink="http://schemas.microsoft.com/office/drawing/2016/ink" xmlns:am3d="http://schemas.microsoft.com/office/drawing/2017/model3d" xmlns:o="urn:schemas-microsoft-com:office:office" xmlns:oel="http://schemas.microsoft.com/office/2019/extlst" xmlns:r="http://schemas.openxmlformats.org/officeDocument/2006/relationships" xmlns:m="http://schemas.openxmlformats.org/officeDocument/2006/math" xmlns:v="urn:schemas-microsoft-com:vml" xmlns:wp14="http://schemas.microsoft.com/office/word/2010/wordprocessingDrawing" xmlns:wp="http://schemas.openxmlformats.org/drawingml/2006/wordprocessingDrawing" xmlns:w10="urn:schemas-microsoft-com:office:word" xmlns:w="http://schemas.openxmlformats.org/wordprocessingml/2006/main" xmlns:w14="http://schemas.microsoft.com/office/word/2010/wordml" xmlns:w15="http://schemas.microsoft.com/office/word/2012/wordml" xmlns:w16cex="http://schemas.microsoft.com/office/word/2018/wordml/cex" xmlns:w16cid="http://schemas.microsoft.com/office/word/2016/wordml/cid" xmlns:w16="http://schemas.microsoft.com/office/word/2018/wordml" xmlns:w16du="http://schemas.microsoft.com/office/word/2023/wordml/word16du" xmlns:w16sdtdh="http://schemas.microsoft.com/office/word/2020/wordml/sdtdatahash" xmlns:w16sdtfl="http://schemas.microsoft.com/office/word/2024/wordml/sdtformatlock" xmlns:w16se="http://schemas.microsoft.com/office/word/2015/wordml/symex" xmlns:wpg="http://schemas.microsoft.com/office/word/2010/wordprocessingGroup" xmlns:wpi="http://schemas.microsoft.com/office/word/2010/wordprocessingInk" xmlns:wne="http://schemas.microsoft.com/office/word/2006/wordml" xmlns:wps="http://schemas.microsoft.com/office/word/2010/wordprocessingShape" mc:Ignorable="w14 w15 w16se w16cid w16 w16cex w16sdtdh w16sdtfl w16du wp14">
+  <w16cid:commentId w16cid:paraId="73A41468" w16cid:durableId="63061089"/>
+  <w16cid:commentId w16cid:paraId="673A0D72" w16cid:durableId="706B0BCB"/>
+  <w16cid:commentId w16cid:paraId="08F011BD" w16cid:durableId="03164A67"/>
+  <w16cid:commentId w16cid:paraId="7B9B8C93" w16cid:durableId="340EEEED"/>
+  <w16cid:commentId w16cid:paraId="291697C2" w16cid:durableId="762D13CE"/>
+</w16cid:commentsIds>
 </file>
 
 <file path=word/numbering.xml><?xml version="1.0" encoding="utf-8"?>
@@ -799,6 +2193,14 @@
     <w:abstractNumId w:val="0"/>
   </w:num>
 </w:numbering>
+</file>
+
+<file path=word/people.xml><?xml version="1.0" encoding="utf-8"?>
+<w15:people xmlns:wpc="http://schemas.microsoft.com/office/word/2010/wordprocessingCanvas" xmlns:cx="http://schemas.microsoft.com/office/drawing/2014/chartex" xmlns:cx1="http://schemas.microsoft.com/office/drawing/2015/9/8/chartex" xmlns:cx2="http://schemas.microsoft.com/office/drawing/2015/10/21/chartex" xmlns:cx3="http://schemas.microsoft.com/office/drawing/2016/5/9/chartex" xmlns:cx4="http://schemas.microsoft.com/office/drawing/2016/5/10/chartex" xmlns:cx5="http://schemas.microsoft.com/office/drawing/2016/5/11/chartex" xmlns:cx6="http://schemas.microsoft.com/office/drawing/2016/5/12/chartex" xmlns:cx7="http://schemas.microsoft.com/office/drawing/2016/5/13/chartex" xmlns:cx8="http://schemas.microsoft.com/office/drawing/2016/5/14/chartex" xmlns:mc="http://schemas.openxmlformats.org/markup-compatibility/2006" xmlns:aink="http://schemas.microsoft.com/office/drawing/2016/ink" xmlns:am3d="http://schemas.microsoft.com/office/drawing/2017/model3d" xmlns:o="urn:schemas-microsoft-com:office:office" xmlns:oel="http://schemas.microsoft.com/office/2019/extlst" xmlns:r="http://schemas.openxmlformats.org/officeDocument/2006/relationships" xmlns:m="http://schemas.openxmlformats.org/officeDocument/2006/math" xmlns:v="urn:schemas-microsoft-com:vml" xmlns:wp14="http://schemas.microsoft.com/office/word/2010/wordprocessingDrawing" xmlns:wp="http://schemas.openxmlformats.org/drawingml/2006/wordprocessingDrawing" xmlns:w10="urn:schemas-microsoft-com:office:word" xmlns:w="http://schemas.openxmlformats.org/wordprocessingml/2006/main" xmlns:w14="http://schemas.microsoft.com/office/word/2010/wordml" xmlns:w15="http://schemas.microsoft.com/office/word/2012/wordml" xmlns:w16cex="http://schemas.microsoft.com/office/word/2018/wordml/cex" xmlns:w16cid="http://schemas.microsoft.com/office/word/2016/wordml/cid" xmlns:w16="http://schemas.microsoft.com/office/word/2018/wordml" xmlns:w16du="http://schemas.microsoft.com/office/word/2023/wordml/word16du" xmlns:w16sdtdh="http://schemas.microsoft.com/office/word/2020/wordml/sdtdatahash" xmlns:w16sdtfl="http://schemas.microsoft.com/office/word/2024/wordml/sdtformatlock" xmlns:w16se="http://schemas.microsoft.com/office/word/2015/wordml/symex" xmlns:wpg="http://schemas.microsoft.com/office/word/2010/wordprocessingGroup" xmlns:wpi="http://schemas.microsoft.com/office/word/2010/wordprocessingInk" xmlns:wne="http://schemas.microsoft.com/office/word/2006/wordml" xmlns:wps="http://schemas.microsoft.com/office/word/2010/wordprocessingShape" mc:Ignorable="w14 w15 w16se w16cid w16 w16cex w16sdtdh w16sdtfl w16du wp14">
+  <w15:person w15:author="Forbes, Brieanne">
+    <w15:presenceInfo w15:providerId="AD" w15:userId="S::brieanne.forbes@pnnl.gov::547ab27e-3fc5-4dc3-bb20-6848b4cffca5"/>
+  </w15:person>
+</w15:people>
 </file>
 
 <file path=word/styles.xml><?xml version="1.0" encoding="utf-8"?>
@@ -1406,7 +2808,6 @@
   <w:style w:type="character" w:default="1" w:styleId="DefaultParagraphFont">
     <w:name w:val="Default Paragraph Font"/>
     <w:uiPriority w:val="1"/>
-    <w:semiHidden/>
     <w:unhideWhenUsed/>
   </w:style>
   <w:style w:type="table" w:default="1" w:styleId="TableNormal">
@@ -12182,6 +13583,110 @@
         <w:shd w:val="clear" w:color="auto" w:fill="FBCAA2" w:themeFill="accent6" w:themeFillTint="7F"/>
       </w:tcPr>
     </w:tblStylePr>
+  </w:style>
+  <w:style w:type="paragraph" w:styleId="Revision">
+    <w:name w:val="Revision"/>
+    <w:hidden/>
+    <w:uiPriority w:val="99"/>
+    <w:semiHidden/>
+    <w:rsid w:val="00294CBB"/>
+    <w:pPr>
+      <w:spacing w:after="0" w:line="240" w:lineRule="auto"/>
+    </w:pPr>
+    <w:rPr>
+      <w:rFonts w:ascii="Arial" w:hAnsi="Arial"/>
+      <w:sz w:val="20"/>
+    </w:rPr>
+  </w:style>
+  <w:style w:type="character" w:styleId="Hyperlink">
+    <w:name w:val="Hyperlink"/>
+    <w:basedOn w:val="DefaultParagraphFont"/>
+    <w:uiPriority w:val="99"/>
+    <w:unhideWhenUsed/>
+    <w:rsid w:val="00294CBB"/>
+    <w:rPr>
+      <w:color w:val="0000FF" w:themeColor="hyperlink"/>
+      <w:u w:val="single"/>
+    </w:rPr>
+  </w:style>
+  <w:style w:type="character" w:styleId="UnresolvedMention">
+    <w:name w:val="Unresolved Mention"/>
+    <w:basedOn w:val="DefaultParagraphFont"/>
+    <w:uiPriority w:val="99"/>
+    <w:semiHidden/>
+    <w:unhideWhenUsed/>
+    <w:rsid w:val="00294CBB"/>
+    <w:rPr>
+      <w:color w:val="605E5C"/>
+      <w:shd w:val="clear" w:color="auto" w:fill="E1DFDD"/>
+    </w:rPr>
+  </w:style>
+  <w:style w:type="character" w:styleId="CommentReference">
+    <w:name w:val="annotation reference"/>
+    <w:basedOn w:val="DefaultParagraphFont"/>
+    <w:uiPriority w:val="99"/>
+    <w:semiHidden/>
+    <w:unhideWhenUsed/>
+    <w:rsid w:val="00294CBB"/>
+    <w:rPr>
+      <w:sz w:val="16"/>
+      <w:szCs w:val="16"/>
+    </w:rPr>
+  </w:style>
+  <w:style w:type="paragraph" w:styleId="CommentText">
+    <w:name w:val="annotation text"/>
+    <w:basedOn w:val="Normal"/>
+    <w:link w:val="CommentTextChar"/>
+    <w:uiPriority w:val="99"/>
+    <w:unhideWhenUsed/>
+    <w:rsid w:val="00294CBB"/>
+    <w:pPr>
+      <w:spacing w:line="240" w:lineRule="auto"/>
+    </w:pPr>
+    <w:rPr>
+      <w:szCs w:val="20"/>
+    </w:rPr>
+  </w:style>
+  <w:style w:type="character" w:customStyle="1" w:styleId="CommentTextChar">
+    <w:name w:val="Comment Text Char"/>
+    <w:basedOn w:val="DefaultParagraphFont"/>
+    <w:link w:val="CommentText"/>
+    <w:uiPriority w:val="99"/>
+    <w:rsid w:val="00294CBB"/>
+    <w:rPr>
+      <w:rFonts w:ascii="Arial" w:hAnsi="Arial"/>
+      <w:sz w:val="20"/>
+      <w:szCs w:val="20"/>
+    </w:rPr>
+  </w:style>
+  <w:style w:type="paragraph" w:styleId="CommentSubject">
+    <w:name w:val="annotation subject"/>
+    <w:basedOn w:val="CommentText"/>
+    <w:next w:val="CommentText"/>
+    <w:link w:val="CommentSubjectChar"/>
+    <w:uiPriority w:val="99"/>
+    <w:semiHidden/>
+    <w:unhideWhenUsed/>
+    <w:rsid w:val="00294CBB"/>
+    <w:rPr>
+      <w:b/>
+      <w:bCs/>
+    </w:rPr>
+  </w:style>
+  <w:style w:type="character" w:customStyle="1" w:styleId="CommentSubjectChar">
+    <w:name w:val="Comment Subject Char"/>
+    <w:basedOn w:val="CommentTextChar"/>
+    <w:link w:val="CommentSubject"/>
+    <w:uiPriority w:val="99"/>
+    <w:semiHidden/>
+    <w:rsid w:val="00294CBB"/>
+    <w:rPr>
+      <w:rFonts w:ascii="Arial" w:hAnsi="Arial"/>
+      <w:b/>
+      <w:bCs/>
+      <w:sz w:val="20"/>
+      <w:szCs w:val="20"/>
+    </w:rPr>
   </w:style>
 </w:styles>
 </file>

</xml_diff>

<commit_message>
Updated files based on data checks
</commit_message>
<xml_diff>
--- a/ESSDIVE_Metadata_Danczak_inreview_SPS_Null_Modeling.docx
+++ b/ESSDIVE_Metadata_Danczak_inreview_SPS_Null_Modeling.docx
@@ -35,11 +35,6 @@
       </w:r>
     </w:p>
     <w:p>
-      <w:pPr>
-        <w:rPr>
-          <w:ins w:id="0" w:author="Forbes, Brieanne" w:date="2026-06-11T08:39:00Z" w16du:dateUtc="2026-06-11T15:39:00Z"/>
-        </w:rPr>
-      </w:pPr>
       <w:r>
         <w:rPr>
           <w:b/>
@@ -49,46 +44,30 @@
       <w:r>
         <w:br/>
       </w:r>
-      <w:ins w:id="1" w:author="Forbes, Brieanne" w:date="2026-06-11T08:39:00Z">
-        <w:r>
-          <w:t>NOTE: The manuscript associated with this data package is currently in review. The data may be revised based on reviewer feedback. Upon manuscript acceptance, this data package will be updated with the final dataset and additional metadata.</w:t>
-        </w:r>
-      </w:ins>
+      <w:r>
+        <w:t>NOTE: The manuscript associated with this data package is currently in review. The data may be revised based on reviewer feedback. Upon manuscript acceptance, this data package will be updated with the final dataset and additional metadata.</w:t>
+      </w:r>
     </w:p>
     <w:p>
       <w:r>
         <w:t xml:space="preserve">This data package is associated with the publication “Non-random processes impacting organic matter chemistry are maximized in mid-order streams” submitted to </w:t>
       </w:r>
-      <w:ins w:id="2" w:author="Forbes, Brieanne" w:date="2026-06-11T08:39:00Z">
-        <w:r>
-          <w:rPr>
-            <w:rPrChange w:id="3" w:author="Forbes, Brieanne" w:date="2026-06-11T08:39:00Z" w16du:dateUtc="2026-06-11T15:39:00Z">
-              <w:rPr>
-                <w:b/>
-                <w:bCs/>
-              </w:rPr>
-            </w:rPrChange>
-          </w:rPr>
-          <w:t>Limnology and Oceanography</w:t>
-        </w:r>
-      </w:ins>
-      <w:ins w:id="4" w:author="Forbes, Brieanne" w:date="2026-06-11T08:39:00Z" w16du:dateUtc="2026-06-11T15:39:00Z">
-        <w:r>
-          <w:rPr>
-            <w:b/>
-            <w:bCs/>
-          </w:rPr>
-          <w:t xml:space="preserve"> (</w:t>
-        </w:r>
-      </w:ins>
+      <w:r>
+        <w:t>Limnology and Oceanography</w:t>
+      </w:r>
+      <w:r>
+        <w:rPr>
+          <w:b/>
+          <w:bCs/>
+        </w:rPr>
+        <w:t xml:space="preserve"> (</w:t>
+      </w:r>
       <w:r>
         <w:t>L&amp;O</w:t>
       </w:r>
-      <w:ins w:id="5" w:author="Forbes, Brieanne" w:date="2026-06-11T08:39:00Z" w16du:dateUtc="2026-06-11T15:39:00Z">
-        <w:r>
-          <w:t>)</w:t>
-        </w:r>
-      </w:ins>
+      <w:r>
+        <w:t>)</w:t>
+      </w:r>
       <w:r>
         <w:t xml:space="preserve"> by Danczak et al. (in review). This package contains data and scripts used to investigate dissolved organic matter (DOM) molecular chemistry and diversification processes across 47 surface-water sampling sites in the Yakima River Basin, Washington, USA, during an August 2021 sampling campaign. The package </w:t>
       </w:r>
@@ -106,270 +85,93 @@
       </w:r>
     </w:p>
     <w:p>
-      <w:del w:id="6" w:author="Forbes, Brieanne" w:date="2026-06-11T08:42:00Z" w16du:dateUtc="2026-06-11T15:42:00Z">
-        <w:r>
-          <w:delText>This data package is associated with the rcfsa-RC2-SPS_Null_Modeling repository found at https://github.com/river-corridors-sfa/rcfsa-RC2-SPS_Null_Modeling</w:delText>
-        </w:r>
-      </w:del>
-      <w:del w:id="7" w:author="Forbes, Brieanne" w:date="2026-06-11T08:45:00Z" w16du:dateUtc="2026-06-11T15:45:00Z">
-        <w:r>
-          <w:delText xml:space="preserve">. </w:delText>
-        </w:r>
-      </w:del>
-      <w:del w:id="8" w:author="Forbes, Brieanne" w:date="2026-06-11T08:43:00Z" w16du:dateUtc="2026-06-11T15:43:00Z">
-        <w:r>
-          <w:delText xml:space="preserve">At the directory level, the repository </w:delText>
-        </w:r>
-      </w:del>
-      <w:ins w:id="9" w:author="Forbes, Brieanne" w:date="2026-06-11T08:43:00Z" w16du:dateUtc="2026-06-11T15:43:00Z">
-        <w:r>
-          <w:t>This data package contains</w:t>
-        </w:r>
-      </w:ins>
-      <w:ins w:id="10" w:author="Forbes, Brieanne" w:date="2026-06-11T08:44:00Z" w16du:dateUtc="2026-06-11T15:44:00Z">
-        <w:r>
-          <w:t xml:space="preserve"> an R-Markdown file for analys</w:t>
-        </w:r>
-      </w:ins>
-      <w:ins w:id="11" w:author="Forbes, Brieanne" w:date="2026-06-11T08:45:00Z" w16du:dateUtc="2026-06-11T15:45:00Z">
-        <w:r>
-          <w:t>e</w:t>
-        </w:r>
-      </w:ins>
-      <w:ins w:id="12" w:author="Forbes, Brieanne" w:date="2026-06-11T08:44:00Z" w16du:dateUtc="2026-06-11T15:44:00Z">
-        <w:r>
-          <w:t xml:space="preserve">s and </w:t>
-        </w:r>
-      </w:ins>
-      <w:ins w:id="13" w:author="Forbes, Brieanne" w:date="2026-06-11T08:45:00Z" w16du:dateUtc="2026-06-11T15:45:00Z">
-        <w:r>
-          <w:t>five</w:t>
-        </w:r>
-      </w:ins>
-      <w:ins w:id="14" w:author="Forbes, Brieanne" w:date="2026-06-11T08:44:00Z" w16du:dateUtc="2026-06-11T15:44:00Z">
-        <w:r>
-          <w:t xml:space="preserve"> folders:</w:t>
-        </w:r>
-      </w:ins>
-      <w:ins w:id="15" w:author="Forbes, Brieanne" w:date="2026-06-11T08:45:00Z" w16du:dateUtc="2026-06-11T15:45:00Z">
-        <w:r>
-          <w:t xml:space="preserve"> </w:t>
-        </w:r>
-      </w:ins>
-      <w:del w:id="16" w:author="Forbes, Brieanne" w:date="2026-06-11T08:43:00Z" w16du:dateUtc="2026-06-11T15:43:00Z">
-        <w:r>
-          <w:delText>is organized into</w:delText>
-        </w:r>
-      </w:del>
-      <w:del w:id="17" w:author="Forbes, Brieanne" w:date="2026-06-11T08:44:00Z" w16du:dateUtc="2026-06-11T15:44:00Z">
-        <w:r>
-          <w:delText xml:space="preserve"> folders </w:delText>
-        </w:r>
-      </w:del>
-      <w:del w:id="18" w:author="Forbes, Brieanne" w:date="2026-06-11T08:43:00Z" w16du:dateUtc="2026-06-11T15:43:00Z">
-        <w:r>
-          <w:delText xml:space="preserve">for </w:delText>
-        </w:r>
-      </w:del>
-      <w:ins w:id="19" w:author="Forbes, Brieanne" w:date="2026-06-11T08:43:00Z" w16du:dateUtc="2026-06-11T15:43:00Z">
-        <w:r>
-          <w:t xml:space="preserve">(1) </w:t>
-        </w:r>
-      </w:ins>
+      <w:r>
+        <w:t xml:space="preserve">This data package contains an R-Markdown file for analyses and five folders: (1) </w:t>
+      </w:r>
       <w:r>
         <w:t xml:space="preserve">Data, </w:t>
       </w:r>
-      <w:ins w:id="20" w:author="Forbes, Brieanne" w:date="2026-06-11T08:43:00Z" w16du:dateUtc="2026-06-11T15:43:00Z">
-        <w:r>
-          <w:t xml:space="preserve">(2) </w:t>
-        </w:r>
-      </w:ins>
+      <w:r>
+        <w:t xml:space="preserve">(2) </w:t>
+      </w:r>
       <w:r>
         <w:t>Geospatial Data,</w:t>
       </w:r>
-      <w:ins w:id="21" w:author="Forbes, Brieanne" w:date="2026-06-11T08:43:00Z" w16du:dateUtc="2026-06-11T15:43:00Z">
-        <w:r>
-          <w:t xml:space="preserve"> (3)</w:t>
-        </w:r>
-      </w:ins>
+      <w:r>
+        <w:t xml:space="preserve"> (3)</w:t>
+      </w:r>
       <w:r>
         <w:t xml:space="preserve"> Supplemental_Files, </w:t>
       </w:r>
-      <w:ins w:id="22" w:author="Forbes, Brieanne" w:date="2026-06-11T08:43:00Z" w16du:dateUtc="2026-06-11T15:43:00Z">
-        <w:r>
-          <w:t>(</w:t>
-        </w:r>
-      </w:ins>
-      <w:ins w:id="23" w:author="Forbes, Brieanne" w:date="2026-06-11T08:45:00Z" w16du:dateUtc="2026-06-11T15:45:00Z">
-        <w:r>
-          <w:t>5</w:t>
-        </w:r>
-      </w:ins>
-      <w:ins w:id="24" w:author="Forbes, Brieanne" w:date="2026-06-11T08:43:00Z" w16du:dateUtc="2026-06-11T15:43:00Z">
-        <w:r>
-          <w:t xml:space="preserve">) </w:t>
-        </w:r>
-      </w:ins>
+      <w:r>
+        <w:t xml:space="preserve">(5) </w:t>
+      </w:r>
       <w:r>
         <w:t>Figures_pdf,</w:t>
       </w:r>
-      <w:ins w:id="25" w:author="Forbes, Brieanne" w:date="2026-06-11T08:45:00Z" w16du:dateUtc="2026-06-11T15:45:00Z">
-        <w:r>
-          <w:t xml:space="preserve"> </w:t>
-        </w:r>
-      </w:ins>
-      <w:ins w:id="26" w:author="Forbes, Brieanne" w:date="2026-06-11T08:43:00Z" w16du:dateUtc="2026-06-11T15:43:00Z">
-        <w:r>
-          <w:t xml:space="preserve">(4) </w:t>
-        </w:r>
-      </w:ins>
-      <w:del w:id="27" w:author="Forbes, Brieanne" w:date="2026-06-11T08:45:00Z" w16du:dateUtc="2026-06-11T15:45:00Z">
-        <w:r>
-          <w:delText xml:space="preserve"> </w:delText>
-        </w:r>
-      </w:del>
-      <w:ins w:id="28" w:author="Forbes, Brieanne" w:date="2026-06-11T08:45:00Z" w16du:dateUtc="2026-06-11T15:45:00Z">
-        <w:r>
-          <w:t xml:space="preserve">and </w:t>
-        </w:r>
-      </w:ins>
+      <w:r>
+        <w:t xml:space="preserve"> (4) and </w:t>
+      </w:r>
       <w:r>
         <w:t>src</w:t>
       </w:r>
-      <w:del w:id="29" w:author="Forbes, Brieanne" w:date="2026-06-11T08:45:00Z" w16du:dateUtc="2026-06-11T15:45:00Z">
-        <w:r>
-          <w:delText>, and data_checks_reports</w:delText>
-        </w:r>
-      </w:del>
-      <w:ins w:id="30" w:author="Forbes, Brieanne" w:date="2026-06-11T08:44:00Z" w16du:dateUtc="2026-06-11T15:44:00Z">
-        <w:r>
-          <w:t>.</w:t>
-        </w:r>
-      </w:ins>
-      <w:del w:id="31" w:author="Forbes, Brieanne" w:date="2026-06-11T08:44:00Z" w16du:dateUtc="2026-06-11T15:44:00Z">
-        <w:r>
-          <w:delText>, along with root-level analysis files including RC2_SPS_Analysis_V8.Rmd, RC2_SPS_Analysis_V8.html, and README.md.</w:delText>
-        </w:r>
-      </w:del>
+      <w:r>
+        <w:t>.</w:t>
+      </w:r>
       <w:r>
         <w:t xml:space="preserve"> The Data folder contains tabular inputs and derived files used in the manuscript analysis</w:t>
       </w:r>
-      <w:ins w:id="32" w:author="Forbes, Brieanne" w:date="2026-06-11T08:45:00Z" w16du:dateUtc="2026-06-11T15:45:00Z">
-        <w:r>
-          <w:t>. T</w:t>
-        </w:r>
-      </w:ins>
-      <w:del w:id="33" w:author="Forbes, Brieanne" w:date="2026-06-11T08:45:00Z" w16du:dateUtc="2026-06-11T15:45:00Z">
-        <w:r>
-          <w:delText>; t</w:delText>
-        </w:r>
-      </w:del>
+      <w:r>
+        <w:t>. T</w:t>
+      </w:r>
       <w:r>
         <w:t>he Geospatial Data folder contains climate and water-balance, hydrologic, land-cover, population/regional water-use, stream, topographic, and stream-order attribute CSV files</w:t>
       </w:r>
-      <w:ins w:id="34" w:author="Forbes, Brieanne" w:date="2026-06-11T08:46:00Z" w16du:dateUtc="2026-06-11T15:46:00Z">
-        <w:r>
-          <w:t>. T</w:t>
-        </w:r>
-      </w:ins>
-      <w:del w:id="35" w:author="Forbes, Brieanne" w:date="2026-06-11T08:46:00Z" w16du:dateUtc="2026-06-11T15:46:00Z">
-        <w:r>
-          <w:delText>; t</w:delText>
-        </w:r>
-      </w:del>
+      <w:r>
+        <w:t>. T</w:t>
+      </w:r>
       <w:r>
         <w:t>he src folder contains scripts used to process data, run analyses, and generate figures</w:t>
       </w:r>
-      <w:ins w:id="36" w:author="Forbes, Brieanne" w:date="2026-06-11T08:46:00Z" w16du:dateUtc="2026-06-11T15:46:00Z">
-        <w:r>
-          <w:t>. The F</w:t>
-        </w:r>
-      </w:ins>
-      <w:del w:id="37" w:author="Forbes, Brieanne" w:date="2026-06-11T08:46:00Z" w16du:dateUtc="2026-06-11T15:46:00Z">
-        <w:r>
-          <w:delText>; F</w:delText>
-        </w:r>
-      </w:del>
+      <w:r>
+        <w:t>. The F</w:t>
+      </w:r>
       <w:r>
         <w:t>igures_pdf</w:t>
       </w:r>
-      <w:ins w:id="38" w:author="Forbes, Brieanne" w:date="2026-06-11T08:46:00Z" w16du:dateUtc="2026-06-11T15:46:00Z">
-        <w:r>
-          <w:t xml:space="preserve"> folder</w:t>
-        </w:r>
-      </w:ins>
+      <w:r>
+        <w:t xml:space="preserve"> folder</w:t>
+      </w:r>
       <w:r>
         <w:t xml:space="preserve"> contains manuscript figure outputs</w:t>
       </w:r>
-      <w:ins w:id="39" w:author="Forbes, Brieanne" w:date="2026-06-11T08:46:00Z" w16du:dateUtc="2026-06-11T15:46:00Z">
-        <w:r>
-          <w:t>.</w:t>
-        </w:r>
-      </w:ins>
-      <w:del w:id="40" w:author="Forbes, Brieanne" w:date="2026-06-11T08:46:00Z" w16du:dateUtc="2026-06-11T15:46:00Z">
-        <w:r>
-          <w:delText>;</w:delText>
-        </w:r>
-      </w:del>
+      <w:r>
+        <w:t>.</w:t>
+      </w:r>
       <w:r>
         <w:t xml:space="preserve"> </w:t>
       </w:r>
-      <w:ins w:id="41" w:author="Forbes, Brieanne" w:date="2026-06-11T08:46:00Z" w16du:dateUtc="2026-06-11T15:46:00Z">
-        <w:r>
-          <w:t xml:space="preserve">The </w:t>
-        </w:r>
-      </w:ins>
+      <w:r>
+        <w:t xml:space="preserve">The </w:t>
+      </w:r>
       <w:r>
         <w:t xml:space="preserve">Supplemental_Files </w:t>
       </w:r>
-      <w:ins w:id="42" w:author="Forbes, Brieanne" w:date="2026-06-11T08:46:00Z" w16du:dateUtc="2026-06-11T15:46:00Z">
-        <w:r>
-          <w:t xml:space="preserve">folder </w:t>
-        </w:r>
-      </w:ins>
+      <w:r>
+        <w:t xml:space="preserve">folder </w:t>
+      </w:r>
       <w:r>
         <w:t>contains supplemental analysis products</w:t>
       </w:r>
-      <w:del w:id="43" w:author="Forbes, Brieanne" w:date="2026-06-11T08:47:00Z" w16du:dateUtc="2026-06-11T15:47:00Z">
-        <w:r>
-          <w:delText xml:space="preserve">; and data_checks_reports contains automated checking outputs. </w:delText>
-        </w:r>
-      </w:del>
-      <w:ins w:id="44" w:author="Forbes, Brieanne" w:date="2026-06-11T08:47:00Z" w16du:dateUtc="2026-06-11T15:47:00Z">
-        <w:r>
-          <w:t>.</w:t>
-        </w:r>
-      </w:ins>
-      <w:del w:id="45" w:author="Forbes, Brieanne" w:date="2026-06-11T08:40:00Z" w16du:dateUtc="2026-06-11T15:40:00Z">
-        <w:r>
-          <w:delText>In addition to this readme, this data package also includes a file-level metadata (FLMD) file that describes each file and a data dictionary (DD) that describes all column/row headers and variable definitions.</w:delText>
-        </w:r>
-      </w:del>
-      <w:ins w:id="46" w:author="Forbes, Brieanne" w:date="2026-06-11T08:43:00Z" w16du:dateUtc="2026-06-11T15:43:00Z">
-        <w:r>
-          <w:t xml:space="preserve"> </w:t>
-        </w:r>
-      </w:ins>
-      <w:ins w:id="47" w:author="Forbes, Brieanne" w:date="2026-06-11T08:47:00Z" w16du:dateUtc="2026-06-11T15:47:00Z">
-        <w:r>
-          <w:t>All files are .csv, .pdf, .html, .png, .R, .Rmd, .svg, or .tre.</w:t>
-        </w:r>
-      </w:ins>
-      <w:ins w:id="48" w:author="Forbes, Brieanne" w:date="2026-06-11T08:48:00Z" w16du:dateUtc="2026-06-11T15:48:00Z">
-        <w:r>
-          <w:t xml:space="preserve"> </w:t>
-        </w:r>
-      </w:ins>
-      <w:ins w:id="49" w:author="Forbes, Brieanne" w:date="2026-06-11T08:43:00Z" w16du:dateUtc="2026-06-11T15:43:00Z">
-        <w:r>
-          <w:t>This data package is associated with the rcfsa-RC2-SPS_Null_Modeling repository found at https://github.com/river-corridors-sfa/rcfsa-RC2-SPS_Null_Modeling</w:t>
-        </w:r>
-      </w:ins>
-      <w:ins w:id="50" w:author="Forbes, Brieanne" w:date="2026-06-11T08:47:00Z" w16du:dateUtc="2026-06-11T15:47:00Z">
-        <w:r>
-          <w:t>.</w:t>
-        </w:r>
-      </w:ins>
+      <w:r>
+        <w:t>.</w:t>
+      </w:r>
+      <w:r>
+        <w:t xml:space="preserve"> </w:t>
+      </w:r>
+      <w:r>
+        <w:t>All files are .csv, .pdf, .html, .png, .R, .Rmd, .svg, or .tre. This data package is associated with the rcfsa-RC2-SPS_Null_Modeling repository found at https://github.com/river-corridors-sfa/rcfsa-RC2-SPS_Null_Modeling.</w:t>
+      </w:r>
     </w:p>
     <w:p>
       <w:pPr>
@@ -389,9 +191,6 @@
     <w:p>
       <w:pPr>
         <w:spacing w:after="0"/>
-        <w:rPr>
-          <w:ins w:id="51" w:author="Forbes, Brieanne" w:date="2026-06-11T08:48:00Z" w16du:dateUtc="2026-06-11T15:48:00Z"/>
-        </w:rPr>
       </w:pPr>
       <w:r>
         <w:t>Yakima River Basin</w:t>
@@ -401,46 +200,24 @@
       <w:pPr>
         <w:spacing w:after="0"/>
       </w:pPr>
-      <w:ins w:id="52" w:author="Forbes, Brieanne" w:date="2026-06-11T08:48:00Z" w16du:dateUtc="2026-06-11T15:48:00Z">
-        <w:r>
-          <w:t>YRB</w:t>
-        </w:r>
-      </w:ins>
+      <w:r>
+        <w:t>YRB</w:t>
+      </w:r>
     </w:p>
     <w:p>
       <w:pPr>
         <w:spacing w:after="0"/>
       </w:pPr>
-      <w:ins w:id="53" w:author="Forbes, Brieanne" w:date="2026-06-11T08:48:00Z" w16du:dateUtc="2026-06-11T15:48:00Z">
-        <w:r>
-          <w:t>S</w:t>
-        </w:r>
-      </w:ins>
-      <w:del w:id="54" w:author="Forbes, Brieanne" w:date="2026-06-11T08:48:00Z" w16du:dateUtc="2026-06-11T15:48:00Z">
-        <w:r>
-          <w:delText>s</w:delText>
-        </w:r>
-      </w:del>
-      <w:r>
-        <w:t>urface water</w:t>
+      <w:r>
+        <w:t>Surface water</w:t>
       </w:r>
     </w:p>
     <w:p>
       <w:pPr>
         <w:spacing w:after="0"/>
       </w:pPr>
-      <w:ins w:id="55" w:author="Forbes, Brieanne" w:date="2026-06-11T08:48:00Z" w16du:dateUtc="2026-06-11T15:48:00Z">
-        <w:r>
-          <w:t>D</w:t>
-        </w:r>
-      </w:ins>
-      <w:del w:id="56" w:author="Forbes, Brieanne" w:date="2026-06-11T08:48:00Z" w16du:dateUtc="2026-06-11T15:48:00Z">
-        <w:r>
-          <w:delText>d</w:delText>
-        </w:r>
-      </w:del>
-      <w:r>
-        <w:t>issolved organic matter</w:t>
+      <w:r>
+        <w:t>Dissolved organic matter</w:t>
       </w:r>
     </w:p>
     <w:p>
@@ -455,18 +232,8 @@
       <w:pPr>
         <w:spacing w:after="0"/>
       </w:pPr>
-      <w:ins w:id="57" w:author="Forbes, Brieanne" w:date="2026-06-11T08:48:00Z" w16du:dateUtc="2026-06-11T15:48:00Z">
-        <w:r>
-          <w:t>O</w:t>
-        </w:r>
-      </w:ins>
-      <w:del w:id="58" w:author="Forbes, Brieanne" w:date="2026-06-11T08:48:00Z" w16du:dateUtc="2026-06-11T15:48:00Z">
-        <w:r>
-          <w:delText>o</w:delText>
-        </w:r>
-      </w:del>
-      <w:r>
-        <w:t>rganic matter</w:t>
+      <w:r>
+        <w:t>Organic matter</w:t>
       </w:r>
     </w:p>
     <w:p>
@@ -480,231 +247,83 @@
     <w:p>
       <w:pPr>
         <w:spacing w:after="0"/>
-        <w:rPr>
-          <w:moveFrom w:id="59" w:author="Forbes, Brieanne" w:date="2026-06-11T08:49:00Z" w16du:dateUtc="2026-06-11T15:49:00Z"/>
-        </w:rPr>
-      </w:pPr>
-      <w:moveFromRangeStart w:id="60" w:author="Forbes, Brieanne" w:date="2026-06-11T08:49:00Z" w:name="move232060193"/>
-      <w:moveFrom w:id="61" w:author="Forbes, Brieanne" w:date="2026-06-11T08:49:00Z" w16du:dateUtc="2026-06-11T15:49:00Z">
-        <w:r>
-          <w:t>FTICR-MS</w:t>
-        </w:r>
-      </w:moveFrom>
+      </w:pPr>
+      <w:r>
+        <w:t>Meta-metabolome ecology</w:t>
+      </w:r>
     </w:p>
     <w:p>
       <w:pPr>
         <w:spacing w:after="0"/>
-        <w:rPr>
-          <w:moveFrom w:id="62" w:author="Forbes, Brieanne" w:date="2026-06-11T08:49:00Z" w16du:dateUtc="2026-06-11T15:49:00Z"/>
-        </w:rPr>
-      </w:pPr>
-      <w:moveFrom w:id="63" w:author="Forbes, Brieanne" w:date="2026-06-11T08:49:00Z" w16du:dateUtc="2026-06-11T15:49:00Z">
-        <w:r>
-          <w:t>Fourier transform ion cyclotron resonance mass spectrometry</w:t>
-        </w:r>
-      </w:moveFrom>
-    </w:p>
-    <w:moveFromRangeEnd w:id="60"/>
-    <w:p>
-      <w:pPr>
-        <w:spacing w:after="0"/>
-      </w:pPr>
-      <w:ins w:id="64" w:author="Forbes, Brieanne" w:date="2026-06-11T08:48:00Z" w16du:dateUtc="2026-06-11T15:48:00Z">
-        <w:r>
-          <w:t>M</w:t>
-        </w:r>
-      </w:ins>
-      <w:del w:id="65" w:author="Forbes, Brieanne" w:date="2026-06-11T08:48:00Z" w16du:dateUtc="2026-06-11T15:48:00Z">
-        <w:r>
-          <w:delText>M</w:delText>
-        </w:r>
-      </w:del>
-      <w:r>
-        <w:t>eta-metabolome ecology</w:t>
+      </w:pPr>
+      <w:r>
+        <w:t>Null modeling</w:t>
       </w:r>
     </w:p>
     <w:p>
       <w:pPr>
         <w:spacing w:after="0"/>
-        <w:rPr>
-          <w:ins w:id="66" w:author="Forbes, Brieanne" w:date="2026-06-11T08:48:00Z" w16du:dateUtc="2026-06-11T15:48:00Z"/>
-        </w:rPr>
-      </w:pPr>
-      <w:ins w:id="67" w:author="Forbes, Brieanne" w:date="2026-06-11T08:48:00Z" w16du:dateUtc="2026-06-11T15:48:00Z">
-        <w:r>
-          <w:t>N</w:t>
-        </w:r>
-      </w:ins>
-      <w:del w:id="68" w:author="Forbes, Brieanne" w:date="2026-06-11T08:48:00Z" w16du:dateUtc="2026-06-11T15:48:00Z">
-        <w:r>
-          <w:delText>n</w:delText>
-        </w:r>
-      </w:del>
-      <w:r>
-        <w:t>ull modeling</w:t>
+      </w:pPr>
+      <w:r>
+        <w:t>Molecular formula</w:t>
       </w:r>
     </w:p>
     <w:p>
       <w:pPr>
         <w:spacing w:after="0"/>
-        <w:rPr>
-          <w:del w:id="69" w:author="Forbes, Brieanne" w:date="2026-06-11T08:49:00Z" w16du:dateUtc="2026-06-11T15:49:00Z"/>
-        </w:rPr>
-      </w:pPr>
+      </w:pPr>
+      <w:r>
+        <w:t>Molecular richness</w:t>
+      </w:r>
     </w:p>
     <w:p>
       <w:pPr>
         <w:spacing w:after="0"/>
-        <w:rPr>
-          <w:del w:id="70" w:author="Forbes, Brieanne" w:date="2026-06-11T08:49:00Z" w16du:dateUtc="2026-06-11T15:49:00Z"/>
-        </w:rPr>
-      </w:pPr>
-      <w:del w:id="71" w:author="Forbes, Brieanne" w:date="2026-06-11T08:49:00Z" w16du:dateUtc="2026-06-11T15:49:00Z">
-        <w:r>
-          <w:delText>βNTI</w:delText>
-        </w:r>
-      </w:del>
+      </w:pPr>
+      <w:r>
+        <w:t>Geochemistry</w:t>
+      </w:r>
     </w:p>
     <w:p>
       <w:pPr>
         <w:spacing w:after="0"/>
       </w:pPr>
-      <w:ins w:id="72" w:author="Forbes, Brieanne" w:date="2026-06-11T08:49:00Z" w16du:dateUtc="2026-06-11T15:49:00Z">
-        <w:r>
-          <w:t>M</w:t>
-        </w:r>
-      </w:ins>
-      <w:del w:id="73" w:author="Forbes, Brieanne" w:date="2026-06-11T08:48:00Z" w16du:dateUtc="2026-06-11T15:48:00Z">
-        <w:r>
-          <w:delText>m</w:delText>
-        </w:r>
-      </w:del>
-      <w:r>
-        <w:t>olecular formula</w:t>
+      <w:r>
+        <w:t>Geospatial attributes</w:t>
       </w:r>
     </w:p>
     <w:p>
       <w:pPr>
         <w:spacing w:after="0"/>
       </w:pPr>
-      <w:ins w:id="74" w:author="Forbes, Brieanne" w:date="2026-06-11T08:48:00Z" w16du:dateUtc="2026-06-11T15:48:00Z">
-        <w:r>
-          <w:t>M</w:t>
-        </w:r>
-      </w:ins>
-      <w:del w:id="75" w:author="Forbes, Brieanne" w:date="2026-06-11T08:48:00Z" w16du:dateUtc="2026-06-11T15:48:00Z">
-        <w:r>
-          <w:delText>m</w:delText>
-        </w:r>
-      </w:del>
-      <w:r>
-        <w:t>olecular richness</w:t>
+      <w:r>
+        <w:t>NHDPlus</w:t>
       </w:r>
     </w:p>
     <w:p>
       <w:pPr>
         <w:spacing w:after="0"/>
       </w:pPr>
-      <w:ins w:id="76" w:author="Forbes, Brieanne" w:date="2026-06-11T08:49:00Z" w16du:dateUtc="2026-06-11T15:49:00Z">
-        <w:r>
-          <w:t>G</w:t>
-        </w:r>
-      </w:ins>
-      <w:del w:id="77" w:author="Forbes, Brieanne" w:date="2026-06-11T08:49:00Z" w16du:dateUtc="2026-06-11T15:49:00Z">
-        <w:r>
-          <w:delText>g</w:delText>
-        </w:r>
-      </w:del>
-      <w:r>
-        <w:t>eochemistry</w:t>
+      <w:r>
+        <w:t>ESS-DIVE CSV File Formatting Guidelines Reporting Format</w:t>
       </w:r>
     </w:p>
     <w:p>
       <w:pPr>
         <w:spacing w:after="0"/>
       </w:pPr>
-      <w:ins w:id="78" w:author="Forbes, Brieanne" w:date="2026-06-11T08:49:00Z" w16du:dateUtc="2026-06-11T15:49:00Z">
-        <w:r>
-          <w:t>G</w:t>
-        </w:r>
-      </w:ins>
-      <w:del w:id="79" w:author="Forbes, Brieanne" w:date="2026-06-11T08:49:00Z" w16du:dateUtc="2026-06-11T15:49:00Z">
-        <w:r>
-          <w:delText>g</w:delText>
-        </w:r>
-      </w:del>
-      <w:r>
-        <w:t>eospatial attributes</w:t>
-      </w:r>
-    </w:p>
-    <w:p>
-      <w:pPr>
-        <w:spacing w:after="0"/>
-        <w:rPr>
-          <w:del w:id="80" w:author="Forbes, Brieanne" w:date="2026-06-11T08:50:00Z" w16du:dateUtc="2026-06-11T15:50:00Z"/>
-        </w:rPr>
-      </w:pPr>
-      <w:del w:id="81" w:author="Forbes, Brieanne" w:date="2026-06-11T08:49:00Z" w16du:dateUtc="2026-06-11T15:49:00Z">
-        <w:r>
-          <w:delText>s</w:delText>
-        </w:r>
-      </w:del>
-      <w:del w:id="82" w:author="Forbes, Brieanne" w:date="2026-06-11T08:50:00Z" w16du:dateUtc="2026-06-11T15:50:00Z">
-        <w:r>
-          <w:delText>tream order</w:delText>
-        </w:r>
-      </w:del>
-    </w:p>
-    <w:p>
-      <w:pPr>
-        <w:spacing w:after="0"/>
-        <w:rPr>
-          <w:del w:id="83" w:author="Forbes, Brieanne" w:date="2026-06-11T08:50:00Z" w16du:dateUtc="2026-06-11T15:50:00Z"/>
-        </w:rPr>
-      </w:pPr>
-      <w:del w:id="84" w:author="Forbes, Brieanne" w:date="2026-06-11T08:49:00Z" w16du:dateUtc="2026-06-11T15:49:00Z">
-        <w:r>
-          <w:delText>d</w:delText>
-        </w:r>
-      </w:del>
-      <w:del w:id="85" w:author="Forbes, Brieanne" w:date="2026-06-11T08:50:00Z" w16du:dateUtc="2026-06-11T15:50:00Z">
-        <w:r>
-          <w:delText>rainage area</w:delText>
-        </w:r>
-      </w:del>
-    </w:p>
-    <w:p>
-      <w:pPr>
-        <w:spacing w:after="0"/>
-      </w:pPr>
-      <w:r>
-        <w:t>NHDPlus</w:t>
-      </w:r>
-    </w:p>
-    <w:p>
-      <w:pPr>
-        <w:spacing w:after="0"/>
-      </w:pPr>
-      <w:r>
-        <w:t>ESS-DIVE CSV File Formatting Guidelines Reporting Format</w:t>
-      </w:r>
-    </w:p>
-    <w:p>
-      <w:pPr>
-        <w:spacing w:after="0"/>
-      </w:pPr>
-      <w:commentRangeStart w:id="86"/>
+      <w:commentRangeStart w:id="0"/>
       <w:r>
         <w:t>ESS-DIVE File Level Metadata Reporting Format</w:t>
       </w:r>
-      <w:commentRangeEnd w:id="86"/>
+      <w:commentRangeEnd w:id="0"/>
       <w:r>
         <w:rPr>
           <w:rStyle w:val="CommentReference"/>
           <w:sz w:val="20"/>
           <w:szCs w:val="22"/>
         </w:rPr>
-        <w:commentReference w:id="86"/>
+        <w:commentReference w:id="0"/>
       </w:r>
     </w:p>
     <w:p>
@@ -715,9 +334,6 @@
     <w:p>
       <w:pPr>
         <w:spacing w:after="0"/>
-        <w:rPr>
-          <w:moveTo w:id="87" w:author="Forbes, Brieanne" w:date="2026-06-11T08:49:00Z" w16du:dateUtc="2026-06-11T15:49:00Z"/>
-        </w:rPr>
       </w:pPr>
       <w:r>
         <w:rPr>
@@ -729,135 +345,78 @@
       <w:r>
         <w:br/>
       </w:r>
-      <w:moveToRangeStart w:id="88" w:author="Forbes, Brieanne" w:date="2026-06-11T08:49:00Z" w:name="move232060193"/>
-      <w:moveTo w:id="89" w:author="Forbes, Brieanne" w:date="2026-06-11T08:49:00Z" w16du:dateUtc="2026-06-11T15:49:00Z">
-        <w:r>
-          <w:t>FTICR-MS</w:t>
-        </w:r>
-      </w:moveTo>
+      <w:r>
+        <w:t>FTICR-MS</w:t>
+      </w:r>
     </w:p>
     <w:p>
       <w:pPr>
         <w:spacing w:after="0"/>
-        <w:rPr>
-          <w:del w:id="90" w:author="Forbes, Brieanne" w:date="2026-06-11T08:49:00Z" w16du:dateUtc="2026-06-11T15:49:00Z"/>
-          <w:moveTo w:id="91" w:author="Forbes, Brieanne" w:date="2026-06-11T08:49:00Z" w16du:dateUtc="2026-06-11T15:49:00Z"/>
-        </w:rPr>
-      </w:pPr>
-      <w:moveTo w:id="92" w:author="Forbes, Brieanne" w:date="2026-06-11T08:49:00Z" w16du:dateUtc="2026-06-11T15:49:00Z">
-        <w:r>
-          <w:t>Fourier transform ion cyclotron resonance mass spectrometry</w:t>
-        </w:r>
-      </w:moveTo>
-    </w:p>
-    <w:moveToRangeEnd w:id="88"/>
-    <w:p>
-      <w:pPr>
-        <w:spacing w:after="0"/>
-      </w:pPr>
-      <w:del w:id="93" w:author="Forbes, Brieanne" w:date="2026-06-11T08:49:00Z" w16du:dateUtc="2026-06-11T15:49:00Z">
-        <w:r>
-          <w:delText>FTICR-MS</w:delText>
-        </w:r>
-      </w:del>
+      </w:pPr>
+      <w:r>
+        <w:t>Fourier transform ion cyclotron resonance mass spectrometry</w:t>
+      </w:r>
     </w:p>
     <w:p>
       <w:pPr>
         <w:spacing w:after="0"/>
       </w:pPr>
-      <w:ins w:id="94" w:author="Forbes, Brieanne" w:date="2026-06-11T08:49:00Z" w16du:dateUtc="2026-06-11T15:49:00Z">
-        <w:r>
-          <w:t>M</w:t>
-        </w:r>
-      </w:ins>
-      <w:del w:id="95" w:author="Forbes, Brieanne" w:date="2026-06-11T08:49:00Z" w16du:dateUtc="2026-06-11T15:49:00Z">
-        <w:r>
-          <w:delText>m</w:delText>
-        </w:r>
-      </w:del>
-      <w:r>
-        <w:t>olecular formula</w:t>
+      <w:r>
+        <w:t>Molecular formula</w:t>
       </w:r>
     </w:p>
     <w:p>
       <w:pPr>
         <w:spacing w:after="0"/>
-        <w:rPr>
-          <w:ins w:id="96" w:author="Forbes, Brieanne" w:date="2026-06-11T08:49:00Z" w16du:dateUtc="2026-06-11T15:49:00Z"/>
-        </w:rPr>
-      </w:pPr>
-      <w:ins w:id="97" w:author="Forbes, Brieanne" w:date="2026-06-11T08:49:00Z" w16du:dateUtc="2026-06-11T15:49:00Z">
-        <w:r>
-          <w:t>M</w:t>
-        </w:r>
-      </w:ins>
-      <w:del w:id="98" w:author="Forbes, Brieanne" w:date="2026-06-11T08:49:00Z" w16du:dateUtc="2026-06-11T15:49:00Z">
-        <w:r>
-          <w:delText>m</w:delText>
-        </w:r>
-      </w:del>
-      <w:r>
-        <w:t>olecular richness</w:t>
+      </w:pPr>
+      <w:r>
+        <w:t>Molecular richness</w:t>
       </w:r>
     </w:p>
     <w:p>
       <w:pPr>
         <w:spacing w:after="0"/>
       </w:pPr>
-      <w:ins w:id="99" w:author="Forbes, Brieanne" w:date="2026-06-11T08:49:00Z" w16du:dateUtc="2026-06-11T15:49:00Z">
-        <w:r>
-          <w:t>B</w:t>
-        </w:r>
-        <w:r>
-          <w:t>eta nearest taxon index</w:t>
-        </w:r>
-      </w:ins>
+      <w:r>
+        <w:t>B</w:t>
+      </w:r>
+      <w:r>
+        <w:t>eta nearest taxon index</w:t>
+      </w:r>
     </w:p>
     <w:p>
       <w:pPr>
         <w:spacing w:after="0"/>
-        <w:rPr>
-          <w:del w:id="100" w:author="Forbes, Brieanne" w:date="2026-06-11T08:49:00Z" w16du:dateUtc="2026-06-11T15:49:00Z"/>
-        </w:rPr>
-      </w:pPr>
-      <w:del w:id="101" w:author="Forbes, Brieanne" w:date="2026-06-11T08:49:00Z" w16du:dateUtc="2026-06-11T15:49:00Z">
-        <w:r>
-          <w:delText>presence/absence peak table</w:delText>
-        </w:r>
-      </w:del>
+      </w:pPr>
+      <w:r>
+        <w:t>βNTI</w:t>
+      </w:r>
     </w:p>
     <w:p>
       <w:pPr>
         <w:spacing w:after="0"/>
-        <w:rPr>
-          <w:ins w:id="102" w:author="Forbes, Brieanne" w:date="2026-06-11T08:50:00Z" w16du:dateUtc="2026-06-11T15:50:00Z"/>
-        </w:rPr>
-      </w:pPr>
-      <w:r>
-        <w:t>βNTI</w:t>
+      </w:pPr>
+      <w:r>
+        <w:t xml:space="preserve">Beta </w:t>
+      </w:r>
+      <w:r>
+        <w:t>mean nearest taxon distance</w:t>
       </w:r>
     </w:p>
     <w:p>
       <w:pPr>
         <w:spacing w:after="0"/>
       </w:pPr>
-      <w:ins w:id="103" w:author="Forbes, Brieanne" w:date="2026-06-11T08:50:00Z" w16du:dateUtc="2026-06-11T15:50:00Z">
-        <w:r>
-          <w:t xml:space="preserve">Beta </w:t>
-        </w:r>
-      </w:ins>
-      <w:ins w:id="104" w:author="Forbes, Brieanne" w:date="2026-06-11T08:50:00Z">
-        <w:r>
-          <w:t>mean nearest taxon distance</w:t>
-        </w:r>
-      </w:ins>
+      <w:r>
+        <w:t>βMNTD</w:t>
+      </w:r>
     </w:p>
     <w:p>
       <w:pPr>
         <w:spacing w:after="0"/>
       </w:pPr>
       <w:r>
-        <w:t>βMNTD</w:t>
+        <w:t>Jaccard distance</w:t>
       </w:r>
     </w:p>
     <w:p>
@@ -865,500 +424,215 @@
         <w:spacing w:after="0"/>
       </w:pPr>
       <w:r>
-        <w:t>Jaccard distance</w:t>
+        <w:t>Chloride</w:t>
       </w:r>
     </w:p>
     <w:p>
       <w:pPr>
         <w:spacing w:after="0"/>
       </w:pPr>
-      <w:ins w:id="105" w:author="Forbes, Brieanne" w:date="2026-06-11T08:50:00Z" w16du:dateUtc="2026-06-11T15:50:00Z">
-        <w:r>
-          <w:t>C</w:t>
-        </w:r>
-      </w:ins>
-      <w:del w:id="106" w:author="Forbes, Brieanne" w:date="2026-06-11T08:50:00Z" w16du:dateUtc="2026-06-11T15:50:00Z">
-        <w:r>
-          <w:delText>c</w:delText>
-        </w:r>
-      </w:del>
-      <w:r>
-        <w:t>hloride</w:t>
+      <w:r>
+        <w:t>Nitrate</w:t>
       </w:r>
     </w:p>
     <w:p>
       <w:pPr>
         <w:spacing w:after="0"/>
       </w:pPr>
-      <w:ins w:id="107" w:author="Forbes, Brieanne" w:date="2026-06-11T08:50:00Z" w16du:dateUtc="2026-06-11T15:50:00Z">
-        <w:r>
-          <w:t>N</w:t>
-        </w:r>
-      </w:ins>
-      <w:del w:id="108" w:author="Forbes, Brieanne" w:date="2026-06-11T08:50:00Z" w16du:dateUtc="2026-06-11T15:50:00Z">
-        <w:r>
-          <w:delText>n</w:delText>
-        </w:r>
-      </w:del>
-      <w:r>
-        <w:t>itrate</w:t>
+      <w:r>
+        <w:t>Sulfate</w:t>
       </w:r>
     </w:p>
     <w:p>
       <w:pPr>
         <w:spacing w:after="0"/>
       </w:pPr>
-      <w:ins w:id="109" w:author="Forbes, Brieanne" w:date="2026-06-11T08:50:00Z" w16du:dateUtc="2026-06-11T15:50:00Z">
-        <w:r>
-          <w:t>S</w:t>
-        </w:r>
-      </w:ins>
-      <w:del w:id="110" w:author="Forbes, Brieanne" w:date="2026-06-11T08:50:00Z" w16du:dateUtc="2026-06-11T15:50:00Z">
-        <w:r>
-          <w:delText>s</w:delText>
-        </w:r>
-      </w:del>
-      <w:r>
-        <w:t>ulfate</w:t>
+      <w:r>
+        <w:t>Non-purgeable organic carbon</w:t>
       </w:r>
     </w:p>
     <w:p>
       <w:pPr>
         <w:spacing w:after="0"/>
-        <w:rPr>
-          <w:ins w:id="111" w:author="Forbes, Brieanne" w:date="2026-06-11T08:50:00Z" w16du:dateUtc="2026-06-11T15:50:00Z"/>
-        </w:rPr>
-      </w:pPr>
-      <w:ins w:id="112" w:author="Forbes, Brieanne" w:date="2026-06-11T08:50:00Z" w16du:dateUtc="2026-06-11T15:50:00Z">
-        <w:r>
-          <w:t>N</w:t>
-        </w:r>
-      </w:ins>
-      <w:del w:id="113" w:author="Forbes, Brieanne" w:date="2026-06-11T08:50:00Z" w16du:dateUtc="2026-06-11T15:50:00Z">
-        <w:r>
-          <w:delText>n</w:delText>
-        </w:r>
-      </w:del>
-      <w:r>
-        <w:t>on-purgeable organic carbon</w:t>
+      </w:pPr>
+      <w:r>
+        <w:t>NPOC</w:t>
       </w:r>
     </w:p>
     <w:p>
       <w:pPr>
         <w:spacing w:after="0"/>
-        <w:rPr>
-          <w:ins w:id="114" w:author="Forbes, Brieanne" w:date="2026-06-11T08:55:00Z" w16du:dateUtc="2026-06-11T15:55:00Z"/>
-        </w:rPr>
-      </w:pPr>
-      <w:del w:id="115" w:author="Forbes, Brieanne" w:date="2026-06-11T08:50:00Z" w16du:dateUtc="2026-06-11T15:50:00Z">
-        <w:r>
-          <w:delText xml:space="preserve"> (</w:delText>
-        </w:r>
-      </w:del>
-      <w:r>
-        <w:t>NPOC</w:t>
-      </w:r>
-      <w:del w:id="116" w:author="Forbes, Brieanne" w:date="2026-06-11T08:50:00Z" w16du:dateUtc="2026-06-11T15:50:00Z">
-        <w:r>
-          <w:delText>)</w:delText>
-        </w:r>
-      </w:del>
+      </w:pPr>
+      <w:r>
+        <w:t>Dissolved organic carbon</w:t>
+      </w:r>
     </w:p>
     <w:p>
       <w:pPr>
         <w:spacing w:after="0"/>
-        <w:rPr>
-          <w:ins w:id="117" w:author="Forbes, Brieanne" w:date="2026-06-11T08:56:00Z" w16du:dateUtc="2026-06-11T15:56:00Z"/>
-        </w:rPr>
-      </w:pPr>
-      <w:ins w:id="118" w:author="Forbes, Brieanne" w:date="2026-06-11T08:55:00Z" w16du:dateUtc="2026-06-11T15:55:00Z">
-        <w:r>
-          <w:t>Dis</w:t>
-        </w:r>
-      </w:ins>
-      <w:ins w:id="119" w:author="Forbes, Brieanne" w:date="2026-06-11T08:56:00Z" w16du:dateUtc="2026-06-11T15:56:00Z">
-        <w:r>
-          <w:t>solved organic carbon</w:t>
-        </w:r>
-      </w:ins>
+      </w:pPr>
+      <w:r>
+        <w:t>DOC</w:t>
+      </w:r>
     </w:p>
     <w:p>
       <w:pPr>
         <w:spacing w:after="0"/>
       </w:pPr>
-      <w:ins w:id="120" w:author="Forbes, Brieanne" w:date="2026-06-11T08:56:00Z" w16du:dateUtc="2026-06-11T15:56:00Z">
-        <w:r>
-          <w:t>DOC</w:t>
-        </w:r>
-      </w:ins>
+      <w:r>
+        <w:t>Total dissolved nitrogen</w:t>
+      </w:r>
     </w:p>
     <w:p>
       <w:pPr>
         <w:spacing w:after="0"/>
-        <w:rPr>
-          <w:ins w:id="121" w:author="Forbes, Brieanne" w:date="2026-06-11T08:50:00Z" w16du:dateUtc="2026-06-11T15:50:00Z"/>
-        </w:rPr>
-      </w:pPr>
-      <w:ins w:id="122" w:author="Forbes, Brieanne" w:date="2026-06-11T08:50:00Z" w16du:dateUtc="2026-06-11T15:50:00Z">
-        <w:r>
-          <w:t>T</w:t>
-        </w:r>
-      </w:ins>
-      <w:del w:id="123" w:author="Forbes, Brieanne" w:date="2026-06-11T08:50:00Z" w16du:dateUtc="2026-06-11T15:50:00Z">
-        <w:r>
-          <w:delText>t</w:delText>
-        </w:r>
-      </w:del>
-      <w:r>
-        <w:t>otal dissolved nitrogen</w:t>
+      </w:pPr>
+      <w:r>
+        <w:t>TN</w:t>
       </w:r>
     </w:p>
     <w:p>
       <w:pPr>
         <w:spacing w:after="0"/>
       </w:pPr>
-      <w:del w:id="124" w:author="Forbes, Brieanne" w:date="2026-06-11T08:50:00Z" w16du:dateUtc="2026-06-11T15:50:00Z">
-        <w:r>
-          <w:delText xml:space="preserve"> (</w:delText>
-        </w:r>
-      </w:del>
-      <w:r>
-        <w:t>TN</w:t>
-      </w:r>
-      <w:del w:id="125" w:author="Forbes, Brieanne" w:date="2026-06-11T08:50:00Z" w16du:dateUtc="2026-06-11T15:50:00Z">
-        <w:r>
-          <w:delText>)</w:delText>
-        </w:r>
-      </w:del>
+      <w:r>
+        <w:t>Dissolved inorganic carbon</w:t>
+      </w:r>
     </w:p>
     <w:p>
       <w:pPr>
         <w:spacing w:after="0"/>
-        <w:rPr>
-          <w:ins w:id="126" w:author="Forbes, Brieanne" w:date="2026-06-11T08:50:00Z" w16du:dateUtc="2026-06-11T15:50:00Z"/>
-        </w:rPr>
-      </w:pPr>
-      <w:ins w:id="127" w:author="Forbes, Brieanne" w:date="2026-06-11T08:50:00Z" w16du:dateUtc="2026-06-11T15:50:00Z">
-        <w:r>
-          <w:t>D</w:t>
-        </w:r>
-      </w:ins>
-      <w:del w:id="128" w:author="Forbes, Brieanne" w:date="2026-06-11T08:50:00Z" w16du:dateUtc="2026-06-11T15:50:00Z">
-        <w:r>
-          <w:delText>d</w:delText>
-        </w:r>
-      </w:del>
-      <w:r>
-        <w:t>issolved inorganic carbon</w:t>
+      </w:pPr>
+      <w:r>
+        <w:t>DIC</w:t>
       </w:r>
     </w:p>
     <w:p>
       <w:pPr>
         <w:spacing w:after="0"/>
       </w:pPr>
-      <w:del w:id="129" w:author="Forbes, Brieanne" w:date="2026-06-11T08:50:00Z" w16du:dateUtc="2026-06-11T15:50:00Z">
-        <w:r>
-          <w:delText xml:space="preserve"> (</w:delText>
-        </w:r>
-      </w:del>
-      <w:r>
-        <w:t>DIC</w:t>
-      </w:r>
-      <w:del w:id="130" w:author="Forbes, Brieanne" w:date="2026-06-11T08:50:00Z" w16du:dateUtc="2026-06-11T15:50:00Z">
-        <w:r>
-          <w:delText>)</w:delText>
-        </w:r>
-      </w:del>
+      <w:r>
+        <w:t>Total suspended solids</w:t>
+      </w:r>
     </w:p>
     <w:p>
       <w:pPr>
         <w:spacing w:after="0"/>
-        <w:rPr>
-          <w:ins w:id="131" w:author="Forbes, Brieanne" w:date="2026-06-11T08:50:00Z" w16du:dateUtc="2026-06-11T15:50:00Z"/>
-        </w:rPr>
-      </w:pPr>
-      <w:ins w:id="132" w:author="Forbes, Brieanne" w:date="2026-06-11T08:50:00Z" w16du:dateUtc="2026-06-11T15:50:00Z">
-        <w:r>
-          <w:t>T</w:t>
-        </w:r>
-      </w:ins>
-      <w:del w:id="133" w:author="Forbes, Brieanne" w:date="2026-06-11T08:50:00Z" w16du:dateUtc="2026-06-11T15:50:00Z">
-        <w:r>
-          <w:delText>t</w:delText>
-        </w:r>
-      </w:del>
-      <w:r>
-        <w:t>otal suspended solids</w:t>
+      </w:pPr>
+      <w:r>
+        <w:t>TSS</w:t>
       </w:r>
     </w:p>
     <w:p>
       <w:pPr>
         <w:spacing w:after="0"/>
       </w:pPr>
-      <w:del w:id="134" w:author="Forbes, Brieanne" w:date="2026-06-11T08:50:00Z" w16du:dateUtc="2026-06-11T15:50:00Z">
-        <w:r>
-          <w:delText xml:space="preserve"> (</w:delText>
-        </w:r>
-      </w:del>
-      <w:r>
-        <w:t>TSS</w:t>
-      </w:r>
-      <w:del w:id="135" w:author="Forbes, Brieanne" w:date="2026-06-11T08:50:00Z" w16du:dateUtc="2026-06-11T15:50:00Z">
-        <w:r>
-          <w:delText>)</w:delText>
-        </w:r>
-      </w:del>
+      <w:r>
+        <w:t>Stream order</w:t>
+      </w:r>
     </w:p>
     <w:p>
       <w:pPr>
         <w:spacing w:after="0"/>
       </w:pPr>
-      <w:ins w:id="136" w:author="Forbes, Brieanne" w:date="2026-06-11T08:50:00Z" w16du:dateUtc="2026-06-11T15:50:00Z">
-        <w:r>
-          <w:t>S</w:t>
-        </w:r>
-      </w:ins>
-      <w:del w:id="137" w:author="Forbes, Brieanne" w:date="2026-06-11T08:50:00Z" w16du:dateUtc="2026-06-11T15:50:00Z">
-        <w:r>
-          <w:delText>s</w:delText>
-        </w:r>
-      </w:del>
-      <w:r>
-        <w:t>tream order</w:t>
+      <w:r>
+        <w:t>Drainage area</w:t>
       </w:r>
     </w:p>
     <w:p>
       <w:pPr>
         <w:spacing w:after="0"/>
       </w:pPr>
-      <w:ins w:id="138" w:author="Forbes, Brieanne" w:date="2026-06-11T08:50:00Z" w16du:dateUtc="2026-06-11T15:50:00Z">
-        <w:r>
-          <w:t>D</w:t>
-        </w:r>
-      </w:ins>
-      <w:del w:id="139" w:author="Forbes, Brieanne" w:date="2026-06-11T08:50:00Z" w16du:dateUtc="2026-06-11T15:50:00Z">
-        <w:r>
-          <w:delText>d</w:delText>
-        </w:r>
-      </w:del>
-      <w:r>
-        <w:t>rainage area</w:t>
+      <w:r>
+        <w:t>Basin area</w:t>
       </w:r>
     </w:p>
     <w:p>
       <w:pPr>
         <w:spacing w:after="0"/>
       </w:pPr>
-      <w:ins w:id="140" w:author="Forbes, Brieanne" w:date="2026-06-11T08:51:00Z" w16du:dateUtc="2026-06-11T15:51:00Z">
-        <w:r>
-          <w:t>B</w:t>
-        </w:r>
-      </w:ins>
-      <w:del w:id="141" w:author="Forbes, Brieanne" w:date="2026-06-11T08:50:00Z" w16du:dateUtc="2026-06-11T15:50:00Z">
-        <w:r>
-          <w:delText>b</w:delText>
-        </w:r>
-      </w:del>
-      <w:r>
-        <w:t>asin area</w:t>
+      <w:r>
+        <w:t>Land cover</w:t>
       </w:r>
     </w:p>
     <w:p>
       <w:pPr>
         <w:spacing w:after="0"/>
       </w:pPr>
-      <w:ins w:id="142" w:author="Forbes, Brieanne" w:date="2026-06-11T08:51:00Z" w16du:dateUtc="2026-06-11T15:51:00Z">
-        <w:r>
-          <w:t>L</w:t>
-        </w:r>
-      </w:ins>
-      <w:del w:id="143" w:author="Forbes, Brieanne" w:date="2026-06-11T08:51:00Z" w16du:dateUtc="2026-06-11T15:51:00Z">
-        <w:r>
-          <w:delText>l</w:delText>
-        </w:r>
-      </w:del>
-      <w:r>
-        <w:t>and cover</w:t>
+      <w:r>
+        <w:t>Agriculture coverage</w:t>
       </w:r>
     </w:p>
     <w:p>
       <w:pPr>
         <w:spacing w:after="0"/>
       </w:pPr>
-      <w:ins w:id="144" w:author="Forbes, Brieanne" w:date="2026-06-11T08:51:00Z" w16du:dateUtc="2026-06-11T15:51:00Z">
-        <w:r>
-          <w:t>A</w:t>
-        </w:r>
-      </w:ins>
-      <w:del w:id="145" w:author="Forbes, Brieanne" w:date="2026-06-11T08:51:00Z" w16du:dateUtc="2026-06-11T15:51:00Z">
-        <w:r>
-          <w:delText>a</w:delText>
-        </w:r>
-      </w:del>
-      <w:r>
-        <w:t>griculture coverage</w:t>
+      <w:r>
+        <w:t>Forest coverage</w:t>
       </w:r>
     </w:p>
     <w:p>
       <w:pPr>
         <w:spacing w:after="0"/>
       </w:pPr>
-      <w:ins w:id="146" w:author="Forbes, Brieanne" w:date="2026-06-11T08:51:00Z" w16du:dateUtc="2026-06-11T15:51:00Z">
-        <w:r>
-          <w:t>F</w:t>
-        </w:r>
-      </w:ins>
-      <w:del w:id="147" w:author="Forbes, Brieanne" w:date="2026-06-11T08:51:00Z" w16du:dateUtc="2026-06-11T15:51:00Z">
-        <w:r>
-          <w:delText>f</w:delText>
-        </w:r>
-      </w:del>
-      <w:r>
-        <w:t>orest coverage</w:t>
+      <w:r>
+        <w:t>Shrub coverage</w:t>
       </w:r>
     </w:p>
     <w:p>
       <w:pPr>
         <w:spacing w:after="0"/>
       </w:pPr>
-      <w:ins w:id="148" w:author="Forbes, Brieanne" w:date="2026-06-11T08:51:00Z" w16du:dateUtc="2026-06-11T15:51:00Z">
-        <w:r>
-          <w:t>S</w:t>
-        </w:r>
-      </w:ins>
-      <w:del w:id="149" w:author="Forbes, Brieanne" w:date="2026-06-11T08:51:00Z" w16du:dateUtc="2026-06-11T15:51:00Z">
-        <w:r>
-          <w:delText>s</w:delText>
-        </w:r>
-      </w:del>
-      <w:r>
-        <w:t>hrub coverage</w:t>
+      <w:r>
+        <w:t>Urban coverage</w:t>
       </w:r>
     </w:p>
     <w:p>
       <w:pPr>
         <w:spacing w:after="0"/>
       </w:pPr>
-      <w:ins w:id="150" w:author="Forbes, Brieanne" w:date="2026-06-11T08:51:00Z" w16du:dateUtc="2026-06-11T15:51:00Z">
-        <w:r>
-          <w:t>U</w:t>
-        </w:r>
-      </w:ins>
-      <w:del w:id="151" w:author="Forbes, Brieanne" w:date="2026-06-11T08:51:00Z" w16du:dateUtc="2026-06-11T15:51:00Z">
-        <w:r>
-          <w:delText>u</w:delText>
-        </w:r>
-      </w:del>
-      <w:r>
-        <w:t>rban coverage</w:t>
+      <w:r>
+        <w:t>Precipitation</w:t>
       </w:r>
     </w:p>
     <w:p>
       <w:pPr>
         <w:spacing w:after="0"/>
       </w:pPr>
-      <w:ins w:id="152" w:author="Forbes, Brieanne" w:date="2026-06-11T08:51:00Z" w16du:dateUtc="2026-06-11T15:51:00Z">
-        <w:r>
-          <w:t>P</w:t>
-        </w:r>
-      </w:ins>
-      <w:del w:id="153" w:author="Forbes, Brieanne" w:date="2026-06-11T08:51:00Z" w16du:dateUtc="2026-06-11T15:51:00Z">
-        <w:r>
-          <w:delText>p</w:delText>
-        </w:r>
-      </w:del>
-      <w:r>
-        <w:t>recipitation</w:t>
+      <w:r>
+        <w:t>Temperature</w:t>
       </w:r>
     </w:p>
     <w:p>
       <w:pPr>
         <w:spacing w:after="0"/>
       </w:pPr>
-      <w:ins w:id="154" w:author="Forbes, Brieanne" w:date="2026-06-11T08:51:00Z" w16du:dateUtc="2026-06-11T15:51:00Z">
-        <w:r>
-          <w:t>T</w:t>
-        </w:r>
-      </w:ins>
-      <w:del w:id="155" w:author="Forbes, Brieanne" w:date="2026-06-11T08:51:00Z" w16du:dateUtc="2026-06-11T15:51:00Z">
-        <w:r>
-          <w:delText>t</w:delText>
-        </w:r>
-      </w:del>
-      <w:r>
-        <w:t>emperature</w:t>
+      <w:r>
+        <w:t>Potential evapotranspiration</w:t>
       </w:r>
     </w:p>
     <w:p>
       <w:pPr>
         <w:spacing w:after="0"/>
       </w:pPr>
-      <w:ins w:id="156" w:author="Forbes, Brieanne" w:date="2026-06-11T08:51:00Z" w16du:dateUtc="2026-06-11T15:51:00Z">
-        <w:r>
-          <w:t>P</w:t>
-        </w:r>
-      </w:ins>
-      <w:del w:id="157" w:author="Forbes, Brieanne" w:date="2026-06-11T08:51:00Z" w16du:dateUtc="2026-06-11T15:51:00Z">
-        <w:r>
-          <w:delText>p</w:delText>
-        </w:r>
-      </w:del>
-      <w:r>
-        <w:t>otential evapotranspiration</w:t>
+      <w:r>
+        <w:t>Actual evapotranspiration</w:t>
       </w:r>
     </w:p>
     <w:p>
       <w:pPr>
         <w:spacing w:after="0"/>
       </w:pPr>
-      <w:ins w:id="158" w:author="Forbes, Brieanne" w:date="2026-06-11T08:51:00Z" w16du:dateUtc="2026-06-11T15:51:00Z">
-        <w:r>
-          <w:t>A</w:t>
-        </w:r>
-      </w:ins>
-      <w:del w:id="159" w:author="Forbes, Brieanne" w:date="2026-06-11T08:51:00Z" w16du:dateUtc="2026-06-11T15:51:00Z">
-        <w:r>
-          <w:delText>a</w:delText>
-        </w:r>
-      </w:del>
-      <w:r>
-        <w:t>ctual evapotranspiration</w:t>
+      <w:r>
+        <w:t>Contact time</w:t>
       </w:r>
     </w:p>
     <w:p>
       <w:pPr>
         <w:spacing w:after="0"/>
       </w:pPr>
-      <w:ins w:id="160" w:author="Forbes, Brieanne" w:date="2026-06-11T08:51:00Z" w16du:dateUtc="2026-06-11T15:51:00Z">
-        <w:r>
-          <w:t>C</w:t>
-        </w:r>
-      </w:ins>
-      <w:del w:id="161" w:author="Forbes, Brieanne" w:date="2026-06-11T08:51:00Z" w16du:dateUtc="2026-06-11T15:51:00Z">
-        <w:r>
-          <w:delText>c</w:delText>
-        </w:r>
-      </w:del>
-      <w:r>
-        <w:t>ontact time</w:t>
-      </w:r>
-    </w:p>
-    <w:p>
-      <w:pPr>
-        <w:spacing w:after="0"/>
-      </w:pPr>
-      <w:ins w:id="162" w:author="Forbes, Brieanne" w:date="2026-06-11T08:51:00Z" w16du:dateUtc="2026-06-11T15:51:00Z">
-        <w:r>
-          <w:t>R</w:t>
-        </w:r>
-      </w:ins>
-      <w:del w:id="163" w:author="Forbes, Brieanne" w:date="2026-06-11T08:51:00Z" w16du:dateUtc="2026-06-11T15:51:00Z">
-        <w:r>
-          <w:delText>r</w:delText>
-        </w:r>
-      </w:del>
-      <w:r>
-        <w:t>echarge rate</w:t>
+      <w:r>
+        <w:t>Recharge rate</w:t>
       </w:r>
     </w:p>
     <w:p>
@@ -1467,18 +741,18 @@
       <w:r>
         <w:t>Velliquette, T., Welch, J., Crow, M., Devarakonda, R., Heinz, S., &amp; Crystal-Ornelas, R. (2021). ESS-</w:t>
       </w:r>
-      <w:commentRangeStart w:id="164"/>
+      <w:commentRangeStart w:id="1"/>
       <w:r>
         <w:t>DIVE</w:t>
       </w:r>
-      <w:commentRangeEnd w:id="164"/>
+      <w:commentRangeEnd w:id="1"/>
       <w:r>
         <w:rPr>
           <w:rStyle w:val="CommentReference"/>
           <w:sz w:val="20"/>
           <w:szCs w:val="22"/>
         </w:rPr>
-        <w:commentReference w:id="164"/>
+        <w:commentReference w:id="1"/>
       </w:r>
       <w:r>
         <w:t xml:space="preserve"> Reporting Format for File-level Metadata. ESS-DIVE Repository. </w:t>
@@ -1506,7 +780,7 @@
       </w:r>
     </w:p>
     <w:p>
-      <w:commentRangeStart w:id="165"/>
+      <w:commentRangeStart w:id="2"/>
       <w:r>
         <w:rPr>
           <w:b/>
@@ -1529,14 +803,14 @@
         <w:br/>
         <w:t>robert.danczak@pnnl.gov; vanessa.garayburu-caruso@pnnl.gov</w:t>
       </w:r>
-      <w:commentRangeEnd w:id="165"/>
+      <w:commentRangeEnd w:id="2"/>
       <w:r>
         <w:rPr>
           <w:rStyle w:val="CommentReference"/>
           <w:sz w:val="20"/>
           <w:szCs w:val="22"/>
         </w:rPr>
-        <w:commentReference w:id="165"/>
+        <w:commentReference w:id="2"/>
       </w:r>
     </w:p>
     <w:p>
@@ -1636,11 +910,9 @@
         <w:br/>
         <w:t>2021-08</w:t>
       </w:r>
-      <w:ins w:id="166" w:author="Forbes, Brieanne" w:date="2026-06-11T08:53:00Z" w16du:dateUtc="2026-06-11T15:53:00Z">
-        <w:r>
-          <w:t>-30</w:t>
-        </w:r>
-      </w:ins>
+      <w:r>
+        <w:t>-30</w:t>
+      </w:r>
     </w:p>
     <w:p>
       <w:r>
@@ -1654,29 +926,22 @@
         <w:br/>
         <w:t>2021-0</w:t>
       </w:r>
-      <w:ins w:id="167" w:author="Forbes, Brieanne" w:date="2026-06-11T08:53:00Z" w16du:dateUtc="2026-06-11T15:53:00Z">
-        <w:r>
-          <w:t>9-</w:t>
-        </w:r>
-        <w:commentRangeStart w:id="168"/>
-        <w:r>
-          <w:t>15</w:t>
-        </w:r>
-      </w:ins>
-      <w:commentRangeEnd w:id="168"/>
+      <w:r>
+        <w:t>9-</w:t>
+      </w:r>
+      <w:commentRangeStart w:id="3"/>
+      <w:r>
+        <w:t>15</w:t>
+      </w:r>
+      <w:commentRangeEnd w:id="3"/>
       <w:r>
         <w:rPr>
           <w:rStyle w:val="CommentReference"/>
           <w:sz w:val="20"/>
           <w:szCs w:val="22"/>
         </w:rPr>
-        <w:commentReference w:id="168"/>
-      </w:r>
-      <w:del w:id="169" w:author="Forbes, Brieanne" w:date="2026-06-11T08:53:00Z" w16du:dateUtc="2026-06-11T15:53:00Z">
-        <w:r>
-          <w:delText>8</w:delText>
-        </w:r>
-      </w:del>
+        <w:commentReference w:id="3"/>
+      </w:r>
     </w:p>
     <w:p>
       <w:r>
@@ -1689,18 +954,18 @@
         <w:br/>
         <w:t xml:space="preserve">Yakima River Basin, Washington, USA; refer to metadata </w:t>
       </w:r>
-      <w:commentRangeStart w:id="170"/>
+      <w:commentRangeStart w:id="4"/>
       <w:r>
         <w:t>spreadsheet</w:t>
       </w:r>
-      <w:commentRangeEnd w:id="170"/>
+      <w:commentRangeEnd w:id="4"/>
       <w:r>
         <w:rPr>
           <w:rStyle w:val="CommentReference"/>
           <w:sz w:val="20"/>
           <w:szCs w:val="22"/>
         </w:rPr>
-        <w:commentReference w:id="170"/>
+        <w:commentReference w:id="4"/>
       </w:r>
     </w:p>
     <w:p>
@@ -1726,142 +991,68 @@
         <w:br/>
         <w:t xml:space="preserve">For a full description of the methods, see the </w:t>
       </w:r>
-      <w:del w:id="171" w:author="Forbes, Brieanne" w:date="2026-06-11T08:54:00Z" w16du:dateUtc="2026-06-11T15:54:00Z">
-        <w:r>
-          <w:delText>Methods section of Danczak et al. (in review)</w:delText>
-        </w:r>
-      </w:del>
-      <w:ins w:id="172" w:author="Forbes, Brieanne" w:date="2026-06-11T08:54:00Z" w16du:dateUtc="2026-06-11T15:54:00Z">
-        <w:r>
-          <w:t>associated manuscript</w:t>
-        </w:r>
-      </w:ins>
+      <w:r>
+        <w:t>associated manuscript</w:t>
+      </w:r>
       <w:r>
         <w:t>. Briefly, surface-water samples and site metadata were collected from 47 Yakima River Basin sites spanning stream orders, land uses, and environmental conditions during August</w:t>
       </w:r>
-      <w:ins w:id="173" w:author="Forbes, Brieanne" w:date="2026-06-11T08:55:00Z" w16du:dateUtc="2026-06-11T15:55:00Z">
-        <w:r>
-          <w:t xml:space="preserve"> and September</w:t>
-        </w:r>
-      </w:ins>
+      <w:r>
+        <w:t xml:space="preserve"> and September</w:t>
+      </w:r>
       <w:r>
         <w:t xml:space="preserve"> 2021. Filtered water samples were analyzed for chloride, nitrate, and sulfate by ion chromatography; non-purgeable organic carbon (NPOC), total dissolved nitrogen (TN), and dissolved inorganic carbon (DIC) using a Shimadzu TOC-L analyzer; and total suspended solids (TSS) from unfiltered water. DOM samples were normalized to 1.5 </w:t>
       </w:r>
-      <w:del w:id="174" w:author="Forbes, Brieanne" w:date="2026-06-11T08:56:00Z" w16du:dateUtc="2026-06-11T15:56:00Z">
-        <w:r>
-          <w:delText>mg C L−1</w:delText>
-        </w:r>
-      </w:del>
-      <w:ins w:id="175" w:author="Forbes, Brieanne" w:date="2026-06-11T08:56:00Z" w16du:dateUtc="2026-06-11T15:56:00Z">
-        <w:r>
-          <w:t>milligrams carbon per liter</w:t>
-        </w:r>
-      </w:ins>
+      <w:r>
+        <w:t>milligrams carbon per liter</w:t>
+      </w:r>
       <w:r>
         <w:t xml:space="preserve">, extracted with </w:t>
       </w:r>
-      <w:ins w:id="176" w:author="Forbes, Brieanne" w:date="2026-06-11T08:56:00Z" w16du:dateUtc="2026-06-11T15:56:00Z">
-        <w:r>
-          <w:t>Priority PolLutant</w:t>
-        </w:r>
-        <w:r>
-          <w:t xml:space="preserve"> (</w:t>
-        </w:r>
-      </w:ins>
+      <w:r>
+        <w:t>Priority PolLutant</w:t>
+      </w:r>
+      <w:r>
+        <w:t xml:space="preserve"> (</w:t>
+      </w:r>
       <w:r>
         <w:t>PPL</w:t>
       </w:r>
-      <w:ins w:id="177" w:author="Forbes, Brieanne" w:date="2026-06-11T08:56:00Z" w16du:dateUtc="2026-06-11T15:56:00Z">
-        <w:r>
-          <w:t>)</w:t>
-        </w:r>
-      </w:ins>
-      <w:r>
-        <w:t xml:space="preserve"> cartridges, and analyzed by 12</w:t>
-      </w:r>
-      <w:del w:id="178" w:author="Forbes, Brieanne" w:date="2026-06-11T08:57:00Z" w16du:dateUtc="2026-06-11T15:57:00Z">
-        <w:r>
-          <w:delText xml:space="preserve"> </w:delText>
-        </w:r>
-      </w:del>
-      <w:r>
-        <w:t xml:space="preserve">T FTICR-MS at </w:t>
-      </w:r>
-      <w:ins w:id="179" w:author="Forbes, Brieanne" w:date="2026-06-11T08:57:00Z" w16du:dateUtc="2026-06-11T15:57:00Z">
-        <w:r>
-          <w:t xml:space="preserve">the </w:t>
-        </w:r>
-      </w:ins>
-      <w:ins w:id="180" w:author="Forbes, Brieanne" w:date="2026-06-11T08:58:00Z" w16du:dateUtc="2026-06-11T15:58:00Z">
-        <w:r>
-          <w:t>Environmental</w:t>
-        </w:r>
-      </w:ins>
-      <w:ins w:id="181" w:author="Forbes, Brieanne" w:date="2026-06-11T08:57:00Z" w16du:dateUtc="2026-06-11T15:57:00Z">
-        <w:r>
-          <w:t xml:space="preserve"> Molecular Sciences Laboratory (</w:t>
-        </w:r>
-      </w:ins>
+      <w:r>
+        <w:t>)</w:t>
+      </w:r>
+      <w:r>
+        <w:t xml:space="preserve"> cartridges, and analyzed by 12T FTICR-MS at </w:t>
+      </w:r>
+      <w:r>
+        <w:t>the Environmental Molecular Sciences Laboratory (</w:t>
+      </w:r>
       <w:r>
         <w:t>EMSL</w:t>
       </w:r>
-      <w:ins w:id="182" w:author="Forbes, Brieanne" w:date="2026-06-11T08:57:00Z" w16du:dateUtc="2026-06-11T15:57:00Z">
-        <w:r>
-          <w:t>)</w:t>
-        </w:r>
-      </w:ins>
+      <w:r>
+        <w:t>)</w:t>
+      </w:r>
       <w:r>
         <w:t xml:space="preserve">. Molecular formulae were assigned using Formultitude </w:t>
       </w:r>
-      <w:ins w:id="183" w:author="Forbes, Brieanne" w:date="2026-06-11T08:58:00Z">
-        <w:r>
-          <w:t>(</w:t>
-        </w:r>
-      </w:ins>
-      <w:ins w:id="184" w:author="Forbes, Brieanne" w:date="2026-06-11T08:58:00Z" w16du:dateUtc="2026-06-11T15:58:00Z">
-        <w:r>
-          <w:fldChar w:fldCharType="begin"/>
-        </w:r>
-        <w:r>
-          <w:instrText>HYPERLINK "</w:instrText>
-        </w:r>
-      </w:ins>
-      <w:ins w:id="185" w:author="Forbes, Brieanne" w:date="2026-06-11T08:58:00Z">
-        <w:r>
-          <w:instrText>https://github.com/PNNL-Comp-Mass-Spec/Formultitude</w:instrText>
-        </w:r>
-      </w:ins>
-      <w:ins w:id="186" w:author="Forbes, Brieanne" w:date="2026-06-11T08:58:00Z" w16du:dateUtc="2026-06-11T15:58:00Z">
-        <w:r>
-          <w:instrText>"</w:instrText>
-        </w:r>
-        <w:r>
-          <w:fldChar w:fldCharType="separate"/>
-        </w:r>
-      </w:ins>
-      <w:ins w:id="187" w:author="Forbes, Brieanne" w:date="2026-06-11T08:58:00Z">
+      <w:r>
+        <w:t>(</w:t>
+      </w:r>
+      <w:hyperlink r:id="rId11" w:history="1">
         <w:r>
           <w:rPr>
             <w:rStyle w:val="Hyperlink"/>
           </w:rPr>
           <w:t>https://github.com/PNNL-Comp-Mass-Spec/Formultitude</w:t>
         </w:r>
-      </w:ins>
-      <w:ins w:id="188" w:author="Forbes, Brieanne" w:date="2026-06-11T08:58:00Z" w16du:dateUtc="2026-06-11T15:58:00Z">
-        <w:r>
-          <w:fldChar w:fldCharType="end"/>
-        </w:r>
-      </w:ins>
-      <w:ins w:id="189" w:author="Forbes, Brieanne" w:date="2026-06-11T08:58:00Z">
-        <w:r>
-          <w:t>)</w:t>
-        </w:r>
-      </w:ins>
-      <w:ins w:id="190" w:author="Forbes, Brieanne" w:date="2026-06-11T08:58:00Z" w16du:dateUtc="2026-06-11T15:58:00Z">
-        <w:r>
-          <w:t xml:space="preserve"> </w:t>
-        </w:r>
-      </w:ins>
+      </w:hyperlink>
+      <w:r>
+        <w:t>)</w:t>
+      </w:r>
+      <w:r>
+        <w:t xml:space="preserve"> </w:t>
+      </w:r>
       <w:r>
         <w:t>and processed with ftmsRanalysis; triplicate samples were merged conservatively by retaining peaks present in all replicates and converting peak intensities to binary presence/absence. Geospatial attributes were extracted using NHDPlus v2, and R scripts were used to calculate DOM richness, beta diversity, molecular characteristics dendrograms, and β-nearest taxon index (βNTI) null-model metrics to evaluate deterministic and stochastic assembly processes.</w:t>
       </w:r>
@@ -1879,7 +1070,7 @@
 
 <file path=word/comments.xml><?xml version="1.0" encoding="utf-8"?>
 <w:comments xmlns:wpc="http://schemas.microsoft.com/office/word/2010/wordprocessingCanvas" xmlns:cx="http://schemas.microsoft.com/office/drawing/2014/chartex" xmlns:cx1="http://schemas.microsoft.com/office/drawing/2015/9/8/chartex" xmlns:cx2="http://schemas.microsoft.com/office/drawing/2015/10/21/chartex" xmlns:cx3="http://schemas.microsoft.com/office/drawing/2016/5/9/chartex" xmlns:cx4="http://schemas.microsoft.com/office/drawing/2016/5/10/chartex" xmlns:cx5="http://schemas.microsoft.com/office/drawing/2016/5/11/chartex" xmlns:cx6="http://schemas.microsoft.com/office/drawing/2016/5/12/chartex" xmlns:cx7="http://schemas.microsoft.com/office/drawing/2016/5/13/chartex" xmlns:cx8="http://schemas.microsoft.com/office/drawing/2016/5/14/chartex" xmlns:mc="http://schemas.openxmlformats.org/markup-compatibility/2006" xmlns:aink="http://schemas.microsoft.com/office/drawing/2016/ink" xmlns:am3d="http://schemas.microsoft.com/office/drawing/2017/model3d" xmlns:o="urn:schemas-microsoft-com:office:office" xmlns:oel="http://schemas.microsoft.com/office/2019/extlst" xmlns:r="http://schemas.openxmlformats.org/officeDocument/2006/relationships" xmlns:m="http://schemas.openxmlformats.org/officeDocument/2006/math" xmlns:v="urn:schemas-microsoft-com:vml" xmlns:wp14="http://schemas.microsoft.com/office/word/2010/wordprocessingDrawing" xmlns:wp="http://schemas.openxmlformats.org/drawingml/2006/wordprocessingDrawing" xmlns:w10="urn:schemas-microsoft-com:office:word" xmlns:w="http://schemas.openxmlformats.org/wordprocessingml/2006/main" xmlns:w14="http://schemas.microsoft.com/office/word/2010/wordml" xmlns:w15="http://schemas.microsoft.com/office/word/2012/wordml" xmlns:w16cex="http://schemas.microsoft.com/office/word/2018/wordml/cex" xmlns:w16cid="http://schemas.microsoft.com/office/word/2016/wordml/cid" xmlns:w16="http://schemas.microsoft.com/office/word/2018/wordml" xmlns:w16du="http://schemas.microsoft.com/office/word/2023/wordml/word16du" xmlns:w16sdtdh="http://schemas.microsoft.com/office/word/2020/wordml/sdtdatahash" xmlns:w16sdtfl="http://schemas.microsoft.com/office/word/2024/wordml/sdtformatlock" xmlns:w16se="http://schemas.microsoft.com/office/word/2015/wordml/symex" xmlns:wpg="http://schemas.microsoft.com/office/word/2010/wordprocessingGroup" xmlns:wpi="http://schemas.microsoft.com/office/word/2010/wordprocessingInk" xmlns:wne="http://schemas.microsoft.com/office/word/2006/wordml" xmlns:wps="http://schemas.microsoft.com/office/word/2010/wordprocessingShape" mc:Ignorable="w14 w15 w16se w16cid w16 w16cex w16sdtdh w16sdtfl w16du wp14">
-  <w:comment w:id="86" w:author="Forbes, Brieanne" w:date="2026-06-11T08:49:00Z" w:initials="BF">
+  <w:comment w:id="0" w:author="Forbes, Brieanne" w:date="2026-06-11T08:49:00Z" w:initials="BF">
     <w:p>
       <w:pPr>
         <w:pStyle w:val="CommentText"/>
@@ -1895,7 +1086,7 @@
       </w:r>
     </w:p>
   </w:comment>
-  <w:comment w:id="164" w:author="Forbes, Brieanne" w:date="2026-06-11T08:51:00Z" w:initials="BF">
+  <w:comment w:id="1" w:author="Forbes, Brieanne" w:date="2026-06-11T08:51:00Z" w:initials="BF">
     <w:p>
       <w:pPr>
         <w:pStyle w:val="CommentText"/>
@@ -1911,7 +1102,7 @@
       </w:r>
     </w:p>
   </w:comment>
-  <w:comment w:id="165" w:author="Forbes, Brieanne" w:date="2026-06-11T08:42:00Z" w:initials="BF">
+  <w:comment w:id="2" w:author="Forbes, Brieanne" w:date="2026-06-11T08:42:00Z" w:initials="BF">
     <w:p>
       <w:pPr>
         <w:pStyle w:val="CommentText"/>
@@ -1927,7 +1118,7 @@
       </w:r>
     </w:p>
   </w:comment>
-  <w:comment w:id="168" w:author="Forbes, Brieanne" w:date="2026-06-11T08:53:00Z" w:initials="BF">
+  <w:comment w:id="3" w:author="Forbes, Brieanne" w:date="2026-06-11T08:53:00Z" w:initials="BF">
     <w:p>
       <w:pPr>
         <w:pStyle w:val="CommentText"/>
@@ -1943,7 +1134,7 @@
       </w:r>
     </w:p>
   </w:comment>
-  <w:comment w:id="170" w:author="Forbes, Brieanne" w:date="2026-06-11T08:54:00Z" w:initials="BF">
+  <w:comment w:id="4" w:author="Forbes, Brieanne" w:date="2026-06-11T08:54:00Z" w:initials="BF">
     <w:p>
       <w:pPr>
         <w:pStyle w:val="CommentText"/>
@@ -2808,6 +1999,7 @@
   <w:style w:type="character" w:default="1" w:styleId="DefaultParagraphFont">
     <w:name w:val="Default Paragraph Font"/>
     <w:uiPriority w:val="1"/>
+    <w:semiHidden/>
     <w:unhideWhenUsed/>
   </w:style>
   <w:style w:type="table" w:default="1" w:styleId="TableNormal">

</xml_diff>